<commit_message>
Complete LAB06 racing circuit and report
</commit_message>
<xml_diff>
--- a/Assets/Documentation/Informe_Laboratorio_06_Waypoints.docx
+++ b/Assets/Documentation/Informe_Laboratorio_06_Waypoints.docx
@@ -7,7 +7,7 @@
         <w:pStyle w:val="Title"/>
       </w:pPr>
       <w:r>
-        <w:t>Laboratorio 06 — Waypoints y circuitos</w:t>
+        <w:t>Laboratorio 06 Waypoints y circuitos</w:t>
       </w:r>
     </w:p>
     <w:p>
@@ -21,6 +21,15 @@
           <w:sz w:val="24"/>
         </w:rPr>
         <w:t>Informe de desarrollo, respuestas y verificación</w:t>
+      </w:r>
+    </w:p>
+    <w:p>
+      <w:pPr>
+        <w:pStyle w:val="Heading1"/>
+        <w:keepNext/>
+      </w:pPr>
+      <w:r>
+        <w:t>Informe de desarrollo y verificacion</w:t>
       </w:r>
     </w:p>
     <w:p>
@@ -39,10 +48,10 @@
         <w:rPr>
           <w:b/>
         </w:rPr>
-        <w:t>Editor:</w:t>
+        <w:t>Editor objetivo:</w:t>
       </w:r>
       <w:r>
-        <w:t xml:space="preserve"> Unity 6, </w:t>
+        <w:t xml:space="preserve"> Unity 6 </w:t>
       </w:r>
       <w:r>
         <w:rPr>
@@ -95,6 +104,69 @@
       </w:r>
     </w:p>
     <w:p>
+      <w:r>
+        <w:rPr>
+          <w:b/>
+        </w:rPr>
+        <w:t>Estudiante:</w:t>
+      </w:r>
+      <w:r>
+        <w:t xml:space="preserve"> ____________________________________</w:t>
+      </w:r>
+    </w:p>
+    <w:p>
+      <w:r>
+        <w:rPr>
+          <w:b/>
+        </w:rPr>
+        <w:t>Curso / grupo:</w:t>
+      </w:r>
+      <w:r>
+        <w:t xml:space="preserve"> _________________________________</w:t>
+      </w:r>
+    </w:p>
+    <w:p>
+      <w:r>
+        <w:rPr>
+          <w:b/>
+        </w:rPr>
+        <w:t>Docente:</w:t>
+      </w:r>
+      <w:r>
+        <w:t xml:space="preserve"> _______________________________________</w:t>
+      </w:r>
+    </w:p>
+    <w:p>
+      <w:r>
+        <w:rPr>
+          <w:b/>
+        </w:rPr>
+        <w:t>Fecha de entrega:</w:t>
+      </w:r>
+      <w:r>
+        <w:t xml:space="preserve"> ______________________________</w:t>
+      </w:r>
+    </w:p>
+    <w:p>
+      <w:pPr>
+        <w:pStyle w:val="Heading1"/>
+        <w:keepNext/>
+      </w:pPr>
+      <w:r>
+        <w:t>Resumen</w:t>
+      </w:r>
+    </w:p>
+    <w:p>
+      <w:r>
+        <w:t>Este informe documenta la implementacion del Laboratorio 06 sobre navegacion mediante waypoints y seguimiento de circuitos. El proyecto Unity contiene la escena de tanques del starter con nueve puntos ordenados y cuatro agentes configurados; tambien incorpora un circuito costero de carreras con quince waypoints, cuatro autos, superficie y barreras con colision, conteo de vueltas, seguimiento directo y seguimiento de un tracker movil. El escenario de autos se genera en el modo de edicion al abrir la escena, para que su geometria, jerarquia, puntos y componentes puedan inspeccionarse sin entrar en Play. Ambas escenas incluyen un panel para cambiar de escena, enfocar vehiculos y controlar el modo de movimiento.</w:t>
+      </w:r>
+    </w:p>
+    <w:p>
+      <w:r>
+        <w:t>Los scripts compilaron con las bibliotecas del Editor objetivo y se revisaron las referencias serializadas de la escena de tanques. No se pudo completar una prueba visual de Play en esta sesion porque Unity Licensing rechazo la conexion de License Client. Por tanto, se describe por separado la implementacion comprobada estaticamente y la prueba interactiva que queda por registrar en las capturas.</w:t>
+      </w:r>
+    </w:p>
+    <w:p>
       <w:pPr>
         <w:pStyle w:val="Heading1"/>
         <w:keepNext/>
@@ -105,7 +177,27 @@
     </w:p>
     <w:p>
       <w:r>
-        <w:t>El laboratorio busca comprender el uso de waypoints para guiar vehículos por un recorrido y aplicar la técnica para formar un circuito. El proyecto conserva el escenario de tanques del starter y añade una escena de carreras con automóviles. También implementa una variante con un tracker móvil para comparar ambos métodos.</w:t>
+        <w:t>1. Comprender como una secuencia de posiciones de referencia puede dirigir la navegacion de un agente.</w:t>
+      </w:r>
+    </w:p>
+    <w:p>
+      <w:r>
+        <w:t>2. Configurar un vehiculo para seguir una ruta ordenada y cerrada.</w:t>
+      </w:r>
+    </w:p>
+    <w:p>
+      <w:r>
+        <w:t>3. Comparar el seguimiento directo de waypoints con el seguimiento de un objeto tracker.</w:t>
+      </w:r>
+    </w:p>
+    <w:p>
+      <w:r>
+        <w:t>4. Modificar el escenario y sus recursos para representar una carrera de autos.</w:t>
+      </w:r>
+    </w:p>
+    <w:p>
+      <w:r>
+        <w:t>5. Inspeccionar la estructura, los componentes y las referencias desde el Editor de Unity.</w:t>
       </w:r>
     </w:p>
     <w:p>
@@ -114,7 +206,59 @@
         <w:keepNext/>
       </w:pPr>
       <w:r>
-        <w:t>2. Desarrollo de las actividades del informe</w:t>
+        <w:t>2. Recursos y entorno</w:t>
+      </w:r>
+    </w:p>
+    <w:p>
+      <w:r>
+        <w:t>El proyecto conserva los recursos del starter suministrado: escena TankRacing, modelos FBX del tanque y la palmera, texturas de arena, materiales de equipo y los datos de iluminacion/reflexion. Los nuevos elementos del circuito se construyen con primitivas y mallas generadas por el proyecto. No dependen de modelos externos que no esten en el paquete de recursos.</w:t>
+      </w:r>
+    </w:p>
+    <w:p>
+      <w:r>
+        <w:t xml:space="preserve">El Editor objetivo es Unity 6 </w:t>
+      </w:r>
+      <w:r>
+        <w:rPr>
+          <w:rFonts w:ascii="Consolas" w:hAnsi="Consolas"/>
+          <w:color w:val="245B7A"/>
+          <w:sz w:val="19"/>
+        </w:rPr>
+        <w:t>6000.3.17f1</w:t>
+      </w:r>
+      <w:r>
+        <w:t xml:space="preserve">. La escena de tanques preserva el contenido base y agrega la ruta y sus seguidores. La escena </w:t>
+      </w:r>
+      <w:r>
+        <w:rPr>
+          <w:rFonts w:ascii="Consolas" w:hAnsi="Consolas"/>
+          <w:color w:val="245B7A"/>
+          <w:sz w:val="19"/>
+        </w:rPr>
+        <w:t>CarCircuit</w:t>
+      </w:r>
+      <w:r>
+        <w:t xml:space="preserve"> incluye un constructor de vista previa en modo edicion (</w:t>
+      </w:r>
+      <w:r>
+        <w:rPr>
+          <w:rFonts w:ascii="Consolas" w:hAnsi="Consolas"/>
+          <w:color w:val="245B7A"/>
+          <w:sz w:val="19"/>
+        </w:rPr>
+        <w:t>ExecuteAlways</w:t>
+      </w:r>
+      <w:r>
+        <w:t>): al abrirla, la jerarquia se completa con la pista, los waypoints, los autos, las barreras, la meta y la interfaz. El Editor guarda esos objetos en la escena al completar la vista previa. La ejecucion de ese paso requiere que Unity importe los scripts y el paquete Input System; en esta sesion no se pudo abrir el Editor para confirmar la vista final por el rechazo de Unity Licensing.</w:t>
+      </w:r>
+    </w:p>
+    <w:p>
+      <w:pPr>
+        <w:pStyle w:val="Heading1"/>
+        <w:keepNext/>
+      </w:pPr>
+      <w:r>
+        <w:t>3. Procedimiento y actividades del laboratorio</w:t>
       </w:r>
     </w:p>
     <w:tbl>
@@ -155,7 +299,7 @@
                 <w:color w:val="FFFFFF"/>
                 <w:sz w:val="18"/>
               </w:rPr>
-              <w:t>Actividad solicitada</w:t>
+              <w:t>Paso del laboratorio</w:t>
             </w:r>
           </w:p>
         </w:tc>
@@ -182,7 +326,7 @@
                 <w:color w:val="FFFFFF"/>
                 <w:sz w:val="18"/>
               </w:rPr>
-              <w:t>Implementación en el proyecto</w:t>
+              <w:t>Desarrollo realizado</w:t>
             </w:r>
           </w:p>
         </w:tc>
@@ -206,7 +350,7 @@
               <w:rPr>
                 <w:sz w:val="18"/>
               </w:rPr>
-              <w:t>Crear un proyecto 3D en Unity</w:t>
+              <w:t>1. Crear un proyecto 3D en Unity</w:t>
             </w:r>
           </w:p>
         </w:tc>
@@ -228,7 +372,7 @@
               <w:rPr>
                 <w:sz w:val="18"/>
               </w:rPr>
-              <w:t xml:space="preserve">Proyecto Unity configurado para abrirse con </w:t>
+              <w:t xml:space="preserve">Se configuro el proyecto para Unity 6 </w:t>
             </w:r>
             <w:r>
               <w:rPr>
@@ -237,6 +381,114 @@
                 <w:sz w:val="18"/>
               </w:rPr>
               <w:t>6000.3.17f1</w:t>
+            </w:r>
+            <w:r>
+              <w:rPr>
+                <w:sz w:val="18"/>
+              </w:rPr>
+              <w:t>, con ambas escenas registradas en Build Settings.</w:t>
+            </w:r>
+          </w:p>
+        </w:tc>
+      </w:tr>
+      <w:tr>
+        <w:tc>
+          <w:tcPr>
+            <w:tcW w:type="dxa" w:w="3600"/>
+            <w:vAlign w:val="center"/>
+            <w:shd w:fill="F1F5F8"/>
+          </w:tcPr>
+          <w:p>
+            <w:pPr>
+              <w:spacing w:after="40" w:before="40"/>
+            </w:pPr>
+            <w:r>
+              <w:rPr>
+                <w:sz w:val="18"/>
+              </w:rPr>
+            </w:r>
+            <w:r>
+              <w:rPr>
+                <w:sz w:val="18"/>
+              </w:rPr>
+              <w:t>2. Obtener los recursos del tutorial</w:t>
+            </w:r>
+          </w:p>
+        </w:tc>
+        <w:tc>
+          <w:tcPr>
+            <w:tcW w:type="dxa" w:w="6120"/>
+            <w:vAlign w:val="center"/>
+            <w:shd w:fill="F1F5F8"/>
+          </w:tcPr>
+          <w:p>
+            <w:pPr>
+              <w:spacing w:after="40" w:before="40"/>
+            </w:pPr>
+            <w:r>
+              <w:rPr>
+                <w:sz w:val="18"/>
+              </w:rPr>
+            </w:r>
+            <w:r>
+              <w:rPr>
+                <w:sz w:val="18"/>
+              </w:rPr>
+              <w:t>Se importaron y organizaron los recursos base del starter proporcionado. El contenido del tutorial se uso como referencia para reproducir la tecnica de circuito y tracker.</w:t>
+            </w:r>
+          </w:p>
+        </w:tc>
+      </w:tr>
+      <w:tr>
+        <w:tc>
+          <w:tcPr>
+            <w:tcW w:type="dxa" w:w="3600"/>
+            <w:vAlign w:val="center"/>
+          </w:tcPr>
+          <w:p>
+            <w:pPr>
+              <w:spacing w:after="40" w:before="40"/>
+            </w:pPr>
+            <w:r>
+              <w:rPr>
+                <w:sz w:val="18"/>
+              </w:rPr>
+            </w:r>
+            <w:r>
+              <w:rPr>
+                <w:sz w:val="18"/>
+              </w:rPr>
+              <w:t>3. Importar los recursos al proyecto</w:t>
+            </w:r>
+          </w:p>
+        </w:tc>
+        <w:tc>
+          <w:tcPr>
+            <w:tcW w:type="dxa" w:w="6120"/>
+            <w:vAlign w:val="center"/>
+          </w:tcPr>
+          <w:p>
+            <w:pPr>
+              <w:spacing w:after="40" w:before="40"/>
+            </w:pPr>
+            <w:r>
+              <w:rPr>
+                <w:sz w:val="18"/>
+              </w:rPr>
+            </w:r>
+            <w:r>
+              <w:rPr>
+                <w:sz w:val="18"/>
+              </w:rPr>
+              <w:t xml:space="preserve">Los FBX, texturas, materiales, escena y datos de iluminacion del starter permanecen dentro de </w:t>
+            </w:r>
+            <w:r>
+              <w:rPr>
+                <w:rFonts w:ascii="Consolas" w:hAnsi="Consolas"/>
+                <w:color w:val="245B7A"/>
+                <w:sz w:val="18"/>
+              </w:rPr>
+              <w:t>Assets</w:t>
             </w:r>
             <w:r>
               <w:rPr>
@@ -267,7 +519,7 @@
               <w:rPr>
                 <w:sz w:val="18"/>
               </w:rPr>
-              <w:t>Descargar/importar los recursos del tutorial y abrir TankRacing</w:t>
+              <w:t>4. Abrir TankRacing</w:t>
             </w:r>
           </w:p>
         </w:tc>
@@ -288,9 +540,17 @@
             </w:r>
             <w:r>
               <w:rPr>
+                <w:rFonts w:ascii="Consolas" w:hAnsi="Consolas"/>
+                <w:color w:val="245B7A"/>
                 <w:sz w:val="18"/>
               </w:rPr>
-              <w:t>Se conservaron los recursos del starter entregado: escena TankRacing, modelos FBX de tanque y palmera, terreno, materiales y datos de iluminación.</w:t>
+              <w:t>Assets/Scenes/TankRacing.unity</w:t>
+            </w:r>
+            <w:r>
+              <w:rPr>
+                <w:sz w:val="18"/>
+              </w:rPr>
+              <w:t xml:space="preserve"> conserva el escenario original que se usa en la primera parte del laboratorio.</w:t>
             </w:r>
           </w:p>
         </w:tc>
@@ -314,7 +574,7 @@
               <w:rPr>
                 <w:sz w:val="18"/>
               </w:rPr>
-              <w:t>Inspeccionar el escenario</w:t>
+              <w:t>5. Inspeccionar el escenario</w:t>
             </w:r>
           </w:p>
         </w:tc>
@@ -336,21 +596,7 @@
               <w:rPr>
                 <w:sz w:val="18"/>
               </w:rPr>
-              <w:t xml:space="preserve">Se preservó el escenario original como base de la escena </w:t>
-            </w:r>
-            <w:r>
-              <w:rPr>
-                <w:rFonts w:ascii="Consolas" w:hAnsi="Consolas"/>
-                <w:color w:val="245B7A"/>
-                <w:sz w:val="18"/>
-              </w:rPr>
-              <w:t>TankRacing</w:t>
-            </w:r>
-            <w:r>
-              <w:rPr>
-                <w:sz w:val="18"/>
-              </w:rPr>
-              <w:t>.</w:t>
+              <w:t>Se identificaron los tanques, el terreno, las palmeras, la camara y la iluminacion antes de ampliar la ruta.</w:t>
             </w:r>
           </w:p>
         </w:tc>
@@ -375,7 +621,7 @@
               <w:rPr>
                 <w:sz w:val="18"/>
               </w:rPr>
-              <w:t>Duplicar y organizar palmeras como referencias</w:t>
+              <w:t>6. Duplicar y ordenar las palmeras</w:t>
             </w:r>
           </w:p>
         </w:tc>
@@ -398,7 +644,7 @@
               <w:rPr>
                 <w:sz w:val="18"/>
               </w:rPr>
-              <w:t xml:space="preserve">La ruta de tanques contiene nueve palmeras distribuidas alrededor del circuito y nueve objetos </w:t>
+              <w:t xml:space="preserve">Se distribuyeron nueve palmeras de referencia alrededor de una ruta cerrada. Hay nueve objetos </w:t>
             </w:r>
             <w:r>
               <w:rPr>
@@ -426,7 +672,7 @@
               <w:rPr>
                 <w:sz w:val="18"/>
               </w:rPr>
-              <w:t>, cada uno asociado a una posición de la ruta.</w:t>
+              <w:t xml:space="preserve"> en el circuito.</w:t>
             </w:r>
           </w:p>
         </w:tc>
@@ -450,7 +696,7 @@
               <w:rPr>
                 <w:sz w:val="18"/>
               </w:rPr>
-              <w:t xml:space="preserve">Revisar </w:t>
+              <w:t xml:space="preserve">7. Revisar </w:t>
             </w:r>
             <w:r>
               <w:rPr>
@@ -460,11 +706,52 @@
               </w:rPr>
               <w:t>FollowWP</w:t>
             </w:r>
+          </w:p>
+        </w:tc>
+        <w:tc>
+          <w:tcPr>
+            <w:tcW w:type="dxa" w:w="6120"/>
+            <w:vAlign w:val="center"/>
+          </w:tcPr>
+          <w:p>
+            <w:pPr>
+              <w:spacing w:after="40" w:before="40"/>
+            </w:pPr>
             <w:r>
               <w:rPr>
                 <w:sz w:val="18"/>
               </w:rPr>
-              <w:t xml:space="preserve"> y añadirlo al tanque</w:t>
+            </w:r>
+            <w:r>
+              <w:rPr>
+                <w:sz w:val="18"/>
+              </w:rPr>
+              <w:t>El componente conserva una lista serializada, velocidad, giro, radio de llegada, punto inicial y separacion de carril.</w:t>
+            </w:r>
+          </w:p>
+        </w:tc>
+      </w:tr>
+      <w:tr>
+        <w:tc>
+          <w:tcPr>
+            <w:tcW w:type="dxa" w:w="3600"/>
+            <w:vAlign w:val="center"/>
+            <w:shd w:fill="F1F5F8"/>
+          </w:tcPr>
+          <w:p>
+            <w:pPr>
+              <w:spacing w:after="40" w:before="40"/>
+            </w:pPr>
+            <w:r>
+              <w:rPr>
+                <w:sz w:val="18"/>
+              </w:rPr>
+            </w:r>
+            <w:r>
+              <w:rPr>
+                <w:sz w:val="18"/>
+              </w:rPr>
+              <w:t>8. Asignar el script al tanque</w:t>
             </w:r>
           </w:p>
         </w:tc>
@@ -472,6 +759,7 @@
           <w:tcPr>
             <w:tcW w:type="dxa" w:w="6120"/>
             <w:vAlign w:val="center"/>
+            <w:shd w:fill="F1F5F8"/>
           </w:tcPr>
           <w:p>
             <w:pPr>
@@ -500,7 +788,53 @@
               <w:rPr>
                 <w:sz w:val="18"/>
               </w:rPr>
-              <w:t>, una lista serializada de los nueve puntos y valores de velocidad/configuración.</w:t>
+              <w:t xml:space="preserve"> en la escena.</w:t>
+            </w:r>
+          </w:p>
+        </w:tc>
+      </w:tr>
+      <w:tr>
+        <w:tc>
+          <w:tcPr>
+            <w:tcW w:type="dxa" w:w="3600"/>
+            <w:vAlign w:val="center"/>
+          </w:tcPr>
+          <w:p>
+            <w:pPr>
+              <w:spacing w:after="40" w:before="40"/>
+            </w:pPr>
+            <w:r>
+              <w:rPr>
+                <w:sz w:val="18"/>
+              </w:rPr>
+            </w:r>
+            <w:r>
+              <w:rPr>
+                <w:sz w:val="18"/>
+              </w:rPr>
+              <w:t>9. Bloquear y desbloquear el Inspector</w:t>
+            </w:r>
+          </w:p>
+        </w:tc>
+        <w:tc>
+          <w:tcPr>
+            <w:tcW w:type="dxa" w:w="6120"/>
+            <w:vAlign w:val="center"/>
+          </w:tcPr>
+          <w:p>
+            <w:pPr>
+              <w:spacing w:after="40" w:before="40"/>
+            </w:pPr>
+            <w:r>
+              <w:rPr>
+                <w:sz w:val="18"/>
+              </w:rPr>
+            </w:r>
+            <w:r>
+              <w:rPr>
+                <w:sz w:val="18"/>
+              </w:rPr>
+              <w:t>La lista de puntos esta serializada en cada componente, por lo que se conserva al guardar la escena.</w:t>
             </w:r>
           </w:p>
         </w:tc>
@@ -525,7 +859,7 @@
               <w:rPr>
                 <w:sz w:val="18"/>
               </w:rPr>
-              <w:t>Bloquear/desbloquear el Inspector y asignar puntos</w:t>
+              <w:t>10. Asignar los puntos de la ruta</w:t>
             </w:r>
           </w:p>
         </w:tc>
@@ -548,7 +882,7 @@
               <w:rPr>
                 <w:sz w:val="18"/>
               </w:rPr>
-              <w:t>Las referencias de waypoints están serializadas en los cuatro componentes de la escena. No es necesario repetir el arrastre manual al abrirla.</w:t>
+              <w:t>Cada seguidor referencia los nueve transforms en el mismo orden; no hace falta volver a arrastrarlos manualmente al abrir el proyecto.</w:t>
             </w:r>
           </w:p>
         </w:tc>
@@ -572,7 +906,7 @@
               <w:rPr>
                 <w:sz w:val="18"/>
               </w:rPr>
-              <w:t>Ejecutar, probar y modificar velocidades</w:t>
+              <w:t>11. Desbloquear el Inspector</w:t>
             </w:r>
           </w:p>
         </w:tc>
@@ -594,49 +928,7 @@
               <w:rPr>
                 <w:sz w:val="18"/>
               </w:rPr>
-              <w:t xml:space="preserve">La lógica permite variar </w:t>
-            </w:r>
-            <w:r>
-              <w:rPr>
-                <w:rFonts w:ascii="Consolas" w:hAnsi="Consolas"/>
-                <w:color w:val="245B7A"/>
-                <w:sz w:val="18"/>
-              </w:rPr>
-              <w:t>moveSpeed</w:t>
-            </w:r>
-            <w:r>
-              <w:rPr>
-                <w:sz w:val="18"/>
-              </w:rPr>
-              <w:t xml:space="preserve">, </w:t>
-            </w:r>
-            <w:r>
-              <w:rPr>
-                <w:rFonts w:ascii="Consolas" w:hAnsi="Consolas"/>
-                <w:color w:val="245B7A"/>
-                <w:sz w:val="18"/>
-              </w:rPr>
-              <w:t>turnSpeed</w:t>
-            </w:r>
-            <w:r>
-              <w:rPr>
-                <w:sz w:val="18"/>
-              </w:rPr>
-              <w:t xml:space="preserve">, </w:t>
-            </w:r>
-            <w:r>
-              <w:rPr>
-                <w:rFonts w:ascii="Consolas" w:hAnsi="Consolas"/>
-                <w:color w:val="245B7A"/>
-                <w:sz w:val="18"/>
-              </w:rPr>
-              <w:t>arrivalDistance</w:t>
-            </w:r>
-            <w:r>
-              <w:rPr>
-                <w:sz w:val="18"/>
-              </w:rPr>
-              <w:t xml:space="preserve"> y el desplazamiento lateral. El código y las referencias se validaron estáticamente; el resultado en Play queda pendiente de ejecución dentro del Editor con licencia, según la limitación de validación indicada abajo.</w:t>
+              <w:t>La configuracion de cada tanque puede revisarse por separado en el Inspector.</w:t>
             </w:r>
           </w:p>
         </w:tc>
@@ -661,7 +953,7 @@
               <w:rPr>
                 <w:sz w:val="18"/>
               </w:rPr>
-              <w:t>Repetir la configuración en los otros tanques</w:t>
+              <w:t>12. Ejecutar y probar el movimiento</w:t>
             </w:r>
           </w:p>
         </w:tc>
@@ -684,7 +976,147 @@
               <w:rPr>
                 <w:sz w:val="18"/>
               </w:rPr>
-              <w:t>Blue, Red, Yellow y Green recorren la misma lista cerrada, con inicios, velocidades y carriles diferentes.</w:t>
+              <w:t>La logica de movimiento y colision esta implementada. La prueba Play en el Editor queda pendiente de evidencia visual por el bloqueo de licencia descrito en la seccion 9.</w:t>
+            </w:r>
+          </w:p>
+        </w:tc>
+      </w:tr>
+      <w:tr>
+        <w:tc>
+          <w:tcPr>
+            <w:tcW w:type="dxa" w:w="3600"/>
+            <w:vAlign w:val="center"/>
+          </w:tcPr>
+          <w:p>
+            <w:pPr>
+              <w:spacing w:after="40" w:before="40"/>
+            </w:pPr>
+            <w:r>
+              <w:rPr>
+                <w:sz w:val="18"/>
+              </w:rPr>
+            </w:r>
+            <w:r>
+              <w:rPr>
+                <w:sz w:val="18"/>
+              </w:rPr>
+              <w:t>13. Cambiar velocidades</w:t>
+            </w:r>
+          </w:p>
+        </w:tc>
+        <w:tc>
+          <w:tcPr>
+            <w:tcW w:type="dxa" w:w="6120"/>
+            <w:vAlign w:val="center"/>
+          </w:tcPr>
+          <w:p>
+            <w:pPr>
+              <w:spacing w:after="40" w:before="40"/>
+            </w:pPr>
+            <w:r>
+              <w:rPr>
+                <w:sz w:val="18"/>
+              </w:rPr>
+            </w:r>
+            <w:r>
+              <w:rPr>
+                <w:sz w:val="18"/>
+              </w:rPr>
+              <w:t>Cada tanque tiene valores de velocidad y carril configurables. En los autos tambien se asignan velocidades distintas para poder comparar el movimiento.</w:t>
+            </w:r>
+          </w:p>
+        </w:tc>
+      </w:tr>
+      <w:tr>
+        <w:tc>
+          <w:tcPr>
+            <w:tcW w:type="dxa" w:w="3600"/>
+            <w:vAlign w:val="center"/>
+            <w:shd w:fill="F1F5F8"/>
+          </w:tcPr>
+          <w:p>
+            <w:pPr>
+              <w:spacing w:after="40" w:before="40"/>
+            </w:pPr>
+            <w:r>
+              <w:rPr>
+                <w:sz w:val="18"/>
+              </w:rPr>
+            </w:r>
+            <w:r>
+              <w:rPr>
+                <w:sz w:val="18"/>
+              </w:rPr>
+              <w:t>14. Repetir para otros tanques</w:t>
+            </w:r>
+          </w:p>
+        </w:tc>
+        <w:tc>
+          <w:tcPr>
+            <w:tcW w:type="dxa" w:w="6120"/>
+            <w:vAlign w:val="center"/>
+            <w:shd w:fill="F1F5F8"/>
+          </w:tcPr>
+          <w:p>
+            <w:pPr>
+              <w:spacing w:after="40" w:before="40"/>
+            </w:pPr>
+            <w:r>
+              <w:rPr>
+                <w:sz w:val="18"/>
+              </w:rPr>
+            </w:r>
+            <w:r>
+              <w:rPr>
+                <w:sz w:val="18"/>
+              </w:rPr>
+              <w:t>Blue, Red, Yellow y Green siguen la misma ruta cerrada desde posiciones iniciales y carriles distintos.</w:t>
+            </w:r>
+          </w:p>
+        </w:tc>
+      </w:tr>
+      <w:tr>
+        <w:tc>
+          <w:tcPr>
+            <w:tcW w:type="dxa" w:w="3600"/>
+            <w:vAlign w:val="center"/>
+          </w:tcPr>
+          <w:p>
+            <w:pPr>
+              <w:spacing w:after="40" w:before="40"/>
+            </w:pPr>
+            <w:r>
+              <w:rPr>
+                <w:sz w:val="18"/>
+              </w:rPr>
+            </w:r>
+            <w:r>
+              <w:rPr>
+                <w:sz w:val="18"/>
+              </w:rPr>
+              <w:t>15. Ejecutar y verificar todos los agentes</w:t>
+            </w:r>
+          </w:p>
+        </w:tc>
+        <w:tc>
+          <w:tcPr>
+            <w:tcW w:type="dxa" w:w="6120"/>
+            <w:vAlign w:val="center"/>
+          </w:tcPr>
+          <w:p>
+            <w:pPr>
+              <w:spacing w:after="40" w:before="40"/>
+            </w:pPr>
+            <w:r>
+              <w:rPr>
+                <w:sz w:val="18"/>
+              </w:rPr>
+            </w:r>
+            <w:r>
+              <w:rPr>
+                <w:sz w:val="18"/>
+              </w:rPr>
+              <w:t>Se compilaron los scripts y se validaron las referencias serializadas. La ejecucion simultanea en Play requiere la captura pendiente una vez Unity Licensing permita abrir el Editor.</w:t>
             </w:r>
           </w:p>
         </w:tc>
@@ -697,14 +1129,37 @@
     </w:p>
     <w:p>
       <w:pPr>
+        <w:pStyle w:val="Heading1"/>
+        <w:keepNext/>
+      </w:pPr>
+      <w:r>
+        <w:t>4. Solucion implementada</w:t>
+      </w:r>
+    </w:p>
+    <w:p>
+      <w:pPr>
         <w:pStyle w:val="Heading2"/>
         <w:keepNext/>
       </w:pPr>
       <w:r>
-        <w:t>Cómo funciona el seguimiento directo</w:t>
+        <w:t>4.1 Ruta de tanques</w:t>
       </w:r>
     </w:p>
     <w:p>
+      <w:r>
+        <w:t xml:space="preserve">La ruta de tanques utiliza nueve transforms asociados a palmeras colocadas a lo largo del circuito. </w:t>
+      </w:r>
+      <w:r>
+        <w:rPr>
+          <w:rFonts w:ascii="Consolas" w:hAnsi="Consolas"/>
+          <w:color w:val="245B7A"/>
+          <w:sz w:val="19"/>
+        </w:rPr>
+        <w:t>WaypointCircuit</w:t>
+      </w:r>
+      <w:r>
+        <w:t xml:space="preserve"> mantiene el orden y permite inspeccionar el trazado en la vista Scene. </w:t>
+      </w:r>
       <w:r>
         <w:rPr>
           <w:rFonts w:ascii="Consolas" w:hAnsi="Consolas"/>
@@ -714,7 +1169,7 @@
         <w:t>FollowWP</w:t>
       </w:r>
       <w:r>
-        <w:t xml:space="preserve"> orienta cada vehículo hacia el punto actual, avanza y cambia al siguiente al entrar en el radio de llegada. El último punto vuelve al primero, por lo que la ruta es cerrada. El giro se limita por </w:t>
+        <w:t xml:space="preserve"> calcula la direccion hacia el punto activo, orienta el vehiculo respetando </w:t>
       </w:r>
       <w:r>
         <w:rPr>
@@ -725,7 +1180,7 @@
         <w:t>turnSpeed</w:t>
       </w:r>
       <w:r>
-        <w:t xml:space="preserve">; </w:t>
+        <w:t xml:space="preserve">, avanza a la velocidad configurada y pasa al siguiente punto al entrar en </w:t>
       </w:r>
       <w:r>
         <w:rPr>
@@ -733,10 +1188,15 @@
           <w:color w:val="245B7A"/>
           <w:sz w:val="19"/>
         </w:rPr>
-        <w:t>laneOffset</w:t>
+        <w:t>arrivalDistance</w:t>
       </w:r>
       <w:r>
-        <w:t xml:space="preserve"> separa los vehículos a los lados de la tangente local. </w:t>
+        <w:t>. Al llegar al ultimo indice, vuelve al primero.</w:t>
+      </w:r>
+    </w:p>
+    <w:p>
+      <w:r>
+        <w:t xml:space="preserve">Los cuatro tanques comparten la ruta, pero arrancan en indices diferentes y usan offsets laterales. Esto separa las trayectorias y permite comparar velocidades. Cuando un vehiculo tiene </w:t>
       </w:r>
       <w:r>
         <w:rPr>
@@ -744,10 +1204,43 @@
           <w:color w:val="245B7A"/>
           <w:sz w:val="19"/>
         </w:rPr>
-        <w:t>WaypointCircuit</w:t>
+        <w:t>Rigidbody</w:t>
       </w:r>
       <w:r>
-        <w:t xml:space="preserve"> puede obtener una ruta desde sus hijos y dibuja sus segmentos en la vista Scene.</w:t>
+        <w:t xml:space="preserve">, el movimiento usa </w:t>
+      </w:r>
+      <w:r>
+        <w:rPr>
+          <w:rFonts w:ascii="Consolas" w:hAnsi="Consolas"/>
+          <w:color w:val="245B7A"/>
+          <w:sz w:val="19"/>
+        </w:rPr>
+        <w:t>MovePosition</w:t>
+      </w:r>
+      <w:r>
+        <w:t xml:space="preserve"> y </w:t>
+      </w:r>
+      <w:r>
+        <w:rPr>
+          <w:rFonts w:ascii="Consolas" w:hAnsi="Consolas"/>
+          <w:color w:val="245B7A"/>
+          <w:sz w:val="19"/>
+        </w:rPr>
+        <w:t>MoveRotation</w:t>
+      </w:r>
+      <w:r>
+        <w:t xml:space="preserve"> en </w:t>
+      </w:r>
+      <w:r>
+        <w:rPr>
+          <w:rFonts w:ascii="Consolas" w:hAnsi="Consolas"/>
+          <w:color w:val="245B7A"/>
+          <w:sz w:val="19"/>
+        </w:rPr>
+        <w:t>FixedUpdate</w:t>
+      </w:r>
+      <w:r>
+        <w:t>; los objetos sin cuerpo rigido conservan el movimiento por transform.</w:t>
       </w:r>
     </w:p>
     <w:p>
@@ -756,72 +1249,7 @@
         <w:keepNext/>
       </w:pPr>
       <w:r>
-        <w:t>Ejercicio propuesto 1: Following a Circuit (&amp; Tracker)</w:t>
-      </w:r>
-    </w:p>
-    <w:p>
-      <w:r>
-        <w:t xml:space="preserve">La implementación incluye ambos enfoques. </w:t>
-      </w:r>
-      <w:r>
-        <w:rPr>
-          <w:rFonts w:ascii="Consolas" w:hAnsi="Consolas"/>
-          <w:color w:val="245B7A"/>
-          <w:sz w:val="19"/>
-        </w:rPr>
-        <w:t>CircuitTracker</w:t>
-      </w:r>
-      <w:r>
-        <w:t xml:space="preserve"> recorre una curva Catmull–Rom muestreada a partir de los waypoints; </w:t>
-      </w:r>
-      <w:r>
-        <w:rPr>
-          <w:rFonts w:ascii="Consolas" w:hAnsi="Consolas"/>
-          <w:color w:val="245B7A"/>
-          <w:sz w:val="19"/>
-        </w:rPr>
-        <w:t>FollowTracker</w:t>
-      </w:r>
-      <w:r>
-        <w:t xml:space="preserve"> persigue la posición del tracker con una distancia de seguimiento. En </w:t>
-      </w:r>
-      <w:r>
-        <w:rPr>
-          <w:rFonts w:ascii="Consolas" w:hAnsi="Consolas"/>
-          <w:color w:val="245B7A"/>
-          <w:sz w:val="19"/>
-        </w:rPr>
-        <w:t>CarCircuit</w:t>
-      </w:r>
-      <w:r>
-        <w:t xml:space="preserve">, la tecla </w:t>
-      </w:r>
-      <w:r>
-        <w:rPr>
-          <w:b/>
-        </w:rPr>
-        <w:t>T</w:t>
-      </w:r>
-      <w:r>
-        <w:t xml:space="preserve"> (o el botón en pantalla) cambia entre seguimiento directo de waypoints y seguimiento del tracker móvil. La tecla </w:t>
-      </w:r>
-      <w:r>
-        <w:rPr>
-          <w:b/>
-        </w:rPr>
-        <w:t>R</w:t>
-      </w:r>
-      <w:r>
-        <w:t xml:space="preserve"> reinicia la escena. Así se puede observar y comparar las dos técnicas en un circuito de carreras.</w:t>
-      </w:r>
-    </w:p>
-    <w:p>
-      <w:pPr>
-        <w:pStyle w:val="Heading2"/>
-        <w:keepNext/>
-      </w:pPr>
-      <w:r>
-        <w:t>Ejercicio propuesto 2: circuito con autos y otros recursos</w:t>
+        <w:t>4.2 Circuito de autos visible en el Editor</w:t>
       </w:r>
     </w:p>
     <w:p>
@@ -837,12 +1265,7 @@
         <w:t>CarCircuit</w:t>
       </w:r>
       <w:r>
-        <w:t xml:space="preserve"> genera en tiempo de ejecución un escenario costero tropical: pista curva cerrada, superficie asfaltada, bordes pintados, pianos, barreras, línea de salida, palmeras, iluminación y cámara. Construye cuatro autos de colores distintos con primitivas de Unity y los mueve por quince puntos de ruta. Los materiales se crean con shaders disponibles en el proyecto; no requiere paquetes externos ni recursos descargados.</w:t>
-      </w:r>
-    </w:p>
-    <w:p>
-      <w:r>
-        <w:t xml:space="preserve">Para abrirla, seleccionar </w:t>
+        <w:t xml:space="preserve"> tiene quince waypoints de control que definen una curva Catmull-Rom cerrada. El componente </w:t>
       </w:r>
       <w:r>
         <w:rPr>
@@ -850,28 +1273,26 @@
           <w:color w:val="245B7A"/>
           <w:sz w:val="19"/>
         </w:rPr>
-        <w:t>Assets/Scenes/CarCircuit.unity</w:t>
+        <w:t>CarCircuitDemo</w:t>
       </w:r>
       <w:r>
-        <w:t xml:space="preserve"> y pulsar Play. La escena se construye al comenzar Play; en ejecución se usa </w:t>
+        <w:t xml:space="preserve"> usa </w:t>
       </w:r>
       <w:r>
         <w:rPr>
-          <w:b/>
+          <w:rFonts w:ascii="Consolas" w:hAnsi="Consolas"/>
+          <w:color w:val="245B7A"/>
+          <w:sz w:val="19"/>
         </w:rPr>
-        <w:t>T</w:t>
+        <w:t>ExecuteAlways</w:t>
       </w:r>
       <w:r>
-        <w:t xml:space="preserve"> para cambiar de método y </w:t>
+        <w:t xml:space="preserve"> para crear la vista previa en modo de edicion y solicitar que el Editor la guarde en la escena. Esta creacion se ejecuta al abrir la escena con los scripts compilados; la vista final debe registrarse con la captura indicada cuando el Editor pueda abrirse.</w:t>
       </w:r>
+    </w:p>
+    <w:p>
       <w:r>
-        <w:rPr>
-          <w:b/>
-        </w:rPr>
-        <w:t>R</w:t>
-      </w:r>
-      <w:r>
-        <w:t xml:space="preserve"> para reiniciar. La escena de tanques es independiente y permanece disponible.</w:t>
+        <w:t>El escenario representa un circuito costero tropical con agua, isla de arena, infield, franja verde de escape, asfalto, lineas de borde, pianos, palmeras con frondas, garages, graderia, iluminacion, camara, señal de salida/meta y cuatro autos de distintos colores. Los autos se construyen con primitivas; sus componentes de seguimiento, fisica y referencias a la ruta quedan visibles para inspeccion.</w:t>
       </w:r>
     </w:p>
     <w:p>
@@ -880,12 +1301,190 @@
         <w:keepNext/>
       </w:pPr>
       <w:r>
-        <w:t>Ejercicio propuesto 3: informe</w:t>
+        <w:t>4.3 Fisica y colisiones</w:t>
+      </w:r>
+    </w:p>
+    <w:p>
+      <w:pPr>
+        <w:pStyle w:val="ListBullet"/>
+      </w:pPr>
+      <w:r>
+        <w:t xml:space="preserve">La superficie asfaltada tiene una malla cerrada y un </w:t>
+      </w:r>
+      <w:r>
+        <w:rPr>
+          <w:rFonts w:ascii="Consolas" w:hAnsi="Consolas"/>
+          <w:color w:val="245B7A"/>
+          <w:sz w:val="19"/>
+        </w:rPr>
+        <w:t>MeshCollider</w:t>
+      </w:r>
+      <w:r>
+        <w:t xml:space="preserve"> no convexo para la pista estatica.</w:t>
+      </w:r>
+    </w:p>
+    <w:p>
+      <w:pPr>
+        <w:pStyle w:val="ListBullet"/>
+      </w:pPr>
+      <w:r>
+        <w:t>Las barreras de seguridad y los pianos tienen colliders de forma cubica.</w:t>
+      </w:r>
+    </w:p>
+    <w:p>
+      <w:pPr>
+        <w:pStyle w:val="ListBullet"/>
+      </w:pPr>
+      <w:r>
+        <w:t xml:space="preserve">Cada auto tiene </w:t>
+      </w:r>
+      <w:r>
+        <w:rPr>
+          <w:rFonts w:ascii="Consolas" w:hAnsi="Consolas"/>
+          <w:color w:val="245B7A"/>
+          <w:sz w:val="19"/>
+        </w:rPr>
+        <w:t>Rigidbody</w:t>
+      </w:r>
+      <w:r>
+        <w:t xml:space="preserve"> dinamico sin gravedad, altura y vuelco restringidos, un </w:t>
+      </w:r>
+      <w:r>
+        <w:rPr>
+          <w:rFonts w:ascii="Consolas" w:hAnsi="Consolas"/>
+          <w:color w:val="245B7A"/>
+          <w:sz w:val="19"/>
+        </w:rPr>
+        <w:t>BoxCollider</w:t>
+      </w:r>
+      <w:r>
+        <w:t xml:space="preserve"> de chasis y cuatro </w:t>
+      </w:r>
+      <w:r>
+        <w:rPr>
+          <w:rFonts w:ascii="Consolas" w:hAnsi="Consolas"/>
+          <w:color w:val="245B7A"/>
+          <w:sz w:val="19"/>
+        </w:rPr>
+        <w:t>WheelCollider</w:t>
+      </w:r>
+      <w:r>
+        <w:t xml:space="preserve"> con radio y suspension configurados. Las ruedas visibles son decorativas para evitar colisiones duplicadas.</w:t>
+      </w:r>
+    </w:p>
+    <w:p>
+      <w:pPr>
+        <w:pStyle w:val="ListBullet"/>
+      </w:pPr>
+      <w:r>
+        <w:t xml:space="preserve">La linea de salida/meta incluye un </w:t>
+      </w:r>
+      <w:r>
+        <w:rPr>
+          <w:rFonts w:ascii="Consolas" w:hAnsi="Consolas"/>
+          <w:color w:val="245B7A"/>
+          <w:sz w:val="19"/>
+        </w:rPr>
+        <w:t>BoxCollider</w:t>
+      </w:r>
+      <w:r>
+        <w:t xml:space="preserve"> configurado como trigger, un </w:t>
+      </w:r>
+      <w:r>
+        <w:rPr>
+          <w:rFonts w:ascii="Consolas" w:hAnsi="Consolas"/>
+          <w:color w:val="245B7A"/>
+          <w:sz w:val="19"/>
+        </w:rPr>
+        <w:t>Rigidbody</w:t>
+      </w:r>
+      <w:r>
+        <w:t xml:space="preserve"> cinemático y un </w:t>
+      </w:r>
+      <w:r>
+        <w:rPr>
+          <w:rFonts w:ascii="Consolas" w:hAnsi="Consolas"/>
+          <w:color w:val="245B7A"/>
+          <w:sz w:val="19"/>
+        </w:rPr>
+        <w:t>RaceLapCounter</w:t>
+      </w:r>
+      <w:r>
+        <w:t xml:space="preserve"> que cuenta una vuelta cuando el auto abandona y vuelve a cruzar la zona.</w:t>
+      </w:r>
+    </w:p>
+    <w:p>
+      <w:pPr>
+        <w:pStyle w:val="ListBullet"/>
+      </w:pPr>
+      <w:r>
+        <w:t>Los elementos decorativos que no participan en el contacto fisico no generan colision innecesaria.</w:t>
+      </w:r>
+    </w:p>
+    <w:p>
+      <w:pPr>
+        <w:pStyle w:val="Heading2"/>
+        <w:keepNext/>
+      </w:pPr>
+      <w:r>
+        <w:t>4.4 Seguimiento directo y tracker</w:t>
       </w:r>
     </w:p>
     <w:p>
       <w:r>
-        <w:t>Este documento responde los ejercicios, describe la implementación y registra el alcance real de la verificación. Puede entregarse junto con el proyecto en el aula virtual.</w:t>
+        <w:t xml:space="preserve">En el modo directo, cada auto usa </w:t>
+      </w:r>
+      <w:r>
+        <w:rPr>
+          <w:rFonts w:ascii="Consolas" w:hAnsi="Consolas"/>
+          <w:color w:val="245B7A"/>
+          <w:sz w:val="19"/>
+        </w:rPr>
+        <w:t>FollowWP</w:t>
+      </w:r>
+      <w:r>
+        <w:t xml:space="preserve"> para seguir la lista ordenada. En el modo tracker, </w:t>
+      </w:r>
+      <w:r>
+        <w:rPr>
+          <w:rFonts w:ascii="Consolas" w:hAnsi="Consolas"/>
+          <w:color w:val="245B7A"/>
+          <w:sz w:val="19"/>
+        </w:rPr>
+        <w:t>CircuitTracker</w:t>
+      </w:r>
+      <w:r>
+        <w:t xml:space="preserve"> recorre la ruta suavizada y </w:t>
+      </w:r>
+      <w:r>
+        <w:rPr>
+          <w:rFonts w:ascii="Consolas" w:hAnsi="Consolas"/>
+          <w:color w:val="245B7A"/>
+          <w:sz w:val="19"/>
+        </w:rPr>
+        <w:t>FollowTracker</w:t>
+      </w:r>
+      <w:r>
+        <w:t xml:space="preserve"> persigue la posicion movil manteniendo una distancia. El panel de navegacion permite alternar entre los dos metodos mientras la escena esta en Play. El tracker y sus componentes permanecen en la escena para que puedan inspeccionarse antes de ejecutar.</w:t>
+      </w:r>
+    </w:p>
+    <w:p>
+      <w:pPr>
+        <w:pStyle w:val="Heading2"/>
+        <w:keepNext/>
+      </w:pPr>
+      <w:r>
+        <w:t>4.5 Panel de navegacion</w:t>
+      </w:r>
+    </w:p>
+    <w:p>
+      <w:r>
+        <w:t>Las dos escenas incluyen un panel UGUI configurado como Screen Space Overlay y visible en Game incluso cuando el Editor no esta en Play. Incluye botones para cambiar entre la escena de tanques y la de autos, avanzar o retroceder entre vehiculos, enfocar el vehiculo seleccionado, volver a la vista general y cambiar el modo de movimiento en la carrera. En la escena de autos tambien muestra vueltas completadas. La generacion visual y la interaccion de botones quedan pendientes de comprobar en el Editor.</w:t>
+      </w:r>
+    </w:p>
+    <w:p>
+      <w:r>
+        <w:t>El proyecto incorpora el paquete Unity Input System y configura el manejo de entrada nuevo para la interfaz. La advertencia deprecada del Input Manager mostrada en la captura se aborda con esa migracion; el paquete debe terminar de resolverse y el Editor puede pedir un reinicio para aplicar el cambio.</w:t>
       </w:r>
     </w:p>
     <w:p>
@@ -894,7 +1493,7 @@
         <w:keepNext/>
       </w:pPr>
       <w:r>
-        <w:t>3. Cuestionario</w:t>
+        <w:t>5. Ejercicios propuestos</w:t>
       </w:r>
     </w:p>
     <w:p>
@@ -903,12 +1502,12 @@
         <w:keepNext/>
       </w:pPr>
       <w:r>
-        <w:t>1. ¿Qué son los waypoints?</w:t>
+        <w:t>Ejercicio 1. Completar Following a Circuit (&amp; Tracker)</w:t>
       </w:r>
     </w:p>
     <w:p>
       <w:r>
-        <w:t>Son posiciones de referencia ubicadas en el espacio del juego. Ordenadas como una lista, describen por dónde debe pasar un personaje o vehículo. Un agente puede dirigirse al punto activo y cambiar al siguiente cuando llega a una distancia establecida. Si el último punto vuelve al primero, la secuencia forma un circuito cerrado.</w:t>
+        <w:t>Se implementan los dos enfoques descritos por el tutorial: seguidores que recorren waypoints directamente y seguidores que persiguen un tracker movil. La escena de autos hace observable la comparacion mediante el boton de modo del panel. El tracker se desplaza sobre una curva suavizada; cada auto conserva su controlador directo para que el cambio de modo no requiera reconfigurar la escena.</w:t>
       </w:r>
     </w:p>
     <w:p>
@@ -917,7 +1516,58 @@
         <w:keepNext/>
       </w:pPr>
       <w:r>
-        <w:t>2. ¿Cómo se implementan en Unity para formar un circuito?</w:t>
+        <w:t>Ejercicio 2. Cambiar el escenario y los recursos para una carrera de autos</w:t>
+      </w:r>
+    </w:p>
+    <w:p>
+      <w:r>
+        <w:t>Se agrego una escena independiente con una pista cerrada, marcaciones de borde, pianos, barreras, meta, garages, graderia, palmeras y cuatro autos. La pista y los obstaculos relevantes tienen colisionadores. Los vehiculos tienen fisica y siguen el circuito. El escenario puede inspeccionarse en el Editor sin Play y navegarse con el panel cuando se ejecuta.</w:t>
+      </w:r>
+    </w:p>
+    <w:p>
+      <w:pPr>
+        <w:pStyle w:val="Heading2"/>
+        <w:keepNext/>
+      </w:pPr>
+      <w:r>
+        <w:t>Ejercicio 3. Elaborar el informe</w:t>
+      </w:r>
+    </w:p>
+    <w:p>
+      <w:r>
+        <w:t>Este documento resume las actividades, la logica, los ejercicios, el cuestionario, las comprobaciones realizadas y las capturas que deben incorporarse como evidencia visual para la entrega.</w:t>
+      </w:r>
+    </w:p>
+    <w:p>
+      <w:pPr>
+        <w:pStyle w:val="Heading1"/>
+        <w:keepNext/>
+      </w:pPr>
+      <w:r>
+        <w:t>6. Cuestionario</w:t>
+      </w:r>
+    </w:p>
+    <w:p>
+      <w:pPr>
+        <w:pStyle w:val="Heading2"/>
+        <w:keepNext/>
+      </w:pPr>
+      <w:r>
+        <w:t>1. ¿Que son los waypoints?</w:t>
+      </w:r>
+    </w:p>
+    <w:p>
+      <w:r>
+        <w:t>Son posiciones de referencia situadas en el espacio del juego. Ordenadas en una secuencia, indican por donde debe pasar un agente. El agente se dirige al punto activo y cambia al siguiente al alcanzar la distancia definida. Si el indice final vuelve al primero, la ruta es cerrada y puede recorrerse repetidamente.</w:t>
+      </w:r>
+    </w:p>
+    <w:p>
+      <w:pPr>
+        <w:pStyle w:val="Heading2"/>
+        <w:keepNext/>
+      </w:pPr>
+      <w:r>
+        <w:t>2. ¿Como se implementan en Unity para formar un circuito?</w:t>
       </w:r>
     </w:p>
     <w:p>
@@ -933,7 +1583,7 @@
         <w:t>Transform</w:t>
       </w:r>
       <w:r>
-        <w:t xml:space="preserve"> en cada posición del recorrido, se guardan en orden en un componente y se asigna ese recorrido al vehículo. En cada actualización, el script calcula la dirección al punto activo, orienta el vehículo gradualmente, avanza a la velocidad configurada y detecta la llegada. Al llegar incrementa el índice; al superar el último índice, lo reinicia a cero. En este proyecto esa lógica está en </w:t>
+        <w:t xml:space="preserve"> en las posiciones del recorrido, se guardan en orden en un componente y se asigna esa lista al vehiculo. En cada paso de actualizacion, un script calcula la direccion al punto actual, rota el vehiculo hacia el objetivo, lo mueve a una velocidad configurada y comprueba si llego. Al llegar, avanza el indice; despues del ultimo punto, reinicia la secuencia. En este proyecto, </w:t>
       </w:r>
       <w:r>
         <w:rPr>
@@ -944,7 +1594,29 @@
         <w:t>FollowWP</w:t>
       </w:r>
       <w:r>
-        <w:t>; la ruta queda representada en la escena por nueve puntos de los tanques y quince de los autos.</w:t>
+        <w:t xml:space="preserve"> ejecuta ese comportamiento. </w:t>
+      </w:r>
+      <w:r>
+        <w:rPr>
+          <w:rFonts w:ascii="Consolas" w:hAnsi="Consolas"/>
+          <w:color w:val="245B7A"/>
+          <w:sz w:val="19"/>
+        </w:rPr>
+        <w:t>WaypointCircuit</w:t>
+      </w:r>
+      <w:r>
+        <w:t xml:space="preserve"> organiza la ruta, y </w:t>
+      </w:r>
+      <w:r>
+        <w:rPr>
+          <w:rFonts w:ascii="Consolas" w:hAnsi="Consolas"/>
+          <w:color w:val="245B7A"/>
+          <w:sz w:val="19"/>
+        </w:rPr>
+        <w:t>CircuitTracker</w:t>
+      </w:r>
+      <w:r>
+        <w:t xml:space="preserve"> ofrece la variante de seguimiento indirecto.</w:t>
       </w:r>
     </w:p>
     <w:p>
@@ -953,7 +1625,15 @@
         <w:keepNext/>
       </w:pPr>
       <w:r>
-        <w:t>4. Verificación y límites</w:t>
+        <w:t>7. Verificacion realizada y pendiente</w:t>
+      </w:r>
+    </w:p>
+    <w:p>
+      <w:r>
+        <w:rPr>
+          <w:b/>
+        </w:rPr>
+        <w:t>Comprobaciones realizadas:</w:t>
       </w:r>
     </w:p>
     <w:p>
@@ -961,7 +1641,7 @@
         <w:pStyle w:val="ListBullet"/>
       </w:pPr>
       <w:r>
-        <w:t xml:space="preserve">Se compiló el conjunto de scripts C# con el compilador incluido en la instalación de Unity 6 </w:t>
+        <w:t xml:space="preserve">Compilacion de todos los scripts runtime y de los bloques de Editor con las bibliotecas de Unity </w:t>
       </w:r>
       <w:r>
         <w:rPr>
@@ -972,7 +1652,7 @@
         <w:t>6000.3.17f1</w:t>
       </w:r>
       <w:r>
-        <w:t>, usando las bibliotecas del Editor.</w:t>
+        <w:t>.</w:t>
       </w:r>
     </w:p>
     <w:p>
@@ -980,7 +1660,7 @@
         <w:pStyle w:val="ListBullet"/>
       </w:pPr>
       <w:r>
-        <w:t>Se revisaron las referencias serializadas de los waypoints, la configuración de escenas de inicio/build y los identificadores de los componentes del proyecto.</w:t>
+        <w:t>Revisión de unicidad de IDs de documentos YAML y de las nueve referencias de waypoint en los cuatro seguidores de tanque.</w:t>
       </w:r>
     </w:p>
     <w:p>
@@ -988,13 +1668,26 @@
         <w:pStyle w:val="ListBullet"/>
       </w:pPr>
       <w:r>
+        <w:t>Revision de los nombres y referencias de componentes de las escenas, de los identificadores de scripts y de la configuracion de Build Settings.</w:t>
+      </w:r>
+    </w:p>
+    <w:p>
+      <w:pPr>
+        <w:pStyle w:val="ListBullet"/>
+      </w:pPr>
+      <w:r>
+        <w:t>Revision estructural del circuito de autos: punto de entrada en modo edicion, malla de pista con collider, barreras, cuerpo rigido/collider de autos, trigger de meta y panel UGUI.</w:t>
+      </w:r>
+    </w:p>
+    <w:p>
+      <w:r>
         <w:rPr>
           <w:b/>
         </w:rPr>
-        <w:t>No se pudo confirmar una ejecución Play de extremo a extremo en esta sesión.</w:t>
+        <w:t>Prueba pendiente:</w:t>
       </w:r>
       <w:r>
-        <w:t xml:space="preserve"> El arranque automatizado del Editor fue rechazado por Unity Licensing (</w:t>
+        <w:t xml:space="preserve"> Unity Licensing rechazo la conexion a </w:t>
       </w:r>
       <w:r>
         <w:rPr>
@@ -1005,7 +1698,7 @@
         <w:t>LicenseClient</w:t>
       </w:r>
       <w:r>
-        <w:t xml:space="preserve"> devolvió conexión rechazada), así que no se afirma que la simulación se haya probado visualmente. Al abrir el proyecto en tu Unity Hub con la licencia activa, ejecuta ambas escenas para completar esa comprobación visual.</w:t>
+        <w:t xml:space="preserve"> al iniciar el Editor en esta sesion. Por eso no se pudo abrir Play y comprobar visualmente el movimiento, las colisiones, el cambio de escenas, el enfoque de camara y el contador de vueltas. No se presentan esas acciones como probadas. Al completar esa ejecucion, agrega las capturas correspondientes en los espacios de la seccion 8.</w:t>
       </w:r>
     </w:p>
     <w:p>
@@ -1014,7 +1707,630 @@
         <w:keepNext/>
       </w:pPr>
       <w:r>
-        <w:t>5. Referencias</w:t>
+        <w:t>8. Registro fotografico</w:t>
+      </w:r>
+    </w:p>
+    <w:p>
+      <w:r>
+        <w:t>Inserta una captura de pantalla en cada espacio. Las primeras capturas deben mostrar la escena en modo de edicion para evidenciar que la jerarquia y el circuito se inspeccionan sin Play. Las capturas de funcionamiento se toman despues de ejecutar la prueba en Unity.</w:t>
+      </w:r>
+    </w:p>
+    <w:p>
+      <w:pPr>
+        <w:pStyle w:val="Heading2"/>
+        <w:keepNext/>
+        <w:spacing w:before="160" w:after="60"/>
+      </w:pPr>
+      <w:r>
+        <w:t>Captura 1. Unity Hub y version del proyecto</w:t>
+      </w:r>
+    </w:p>
+    <w:tbl>
+      <w:tblPr>
+        <w:tblW w:type="auto" w:w="0"/>
+        <w:jc w:val="center"/>
+        <w:tblLook w:firstColumn="1" w:firstRow="1" w:lastColumn="0" w:lastRow="0" w:noHBand="0" w:noVBand="1" w:val="04A0"/>
+      </w:tblPr>
+      <w:tblGrid>
+        <w:gridCol w:w="9994"/>
+      </w:tblGrid>
+      <w:tr>
+        <w:trPr>
+          <w:trHeight w:val="2131" w:hRule="atLeast"/>
+        </w:trPr>
+        <w:tc>
+          <w:tcPr>
+            <w:tcW w:type="dxa" w:w="9936"/>
+            <w:vAlign w:val="center"/>
+            <w:shd w:fill="F3F7F9"/>
+            <w:tcBorders>
+              <w:top w:val="single" w:sz="10" w:color="9DB2BF"/>
+              <w:left w:val="single" w:sz="10" w:color="9DB2BF"/>
+              <w:bottom w:val="single" w:sz="10" w:color="9DB2BF"/>
+              <w:right w:val="single" w:sz="10" w:color="9DB2BF"/>
+            </w:tcBorders>
+          </w:tcPr>
+          <w:p>
+            <w:pPr>
+              <w:spacing w:before="480" w:after="80"/>
+              <w:jc w:val="center"/>
+            </w:pPr>
+            <w:r>
+              <w:rPr>
+                <w:b/>
+                <w:color w:val="6E818C"/>
+                <w:sz w:val="22"/>
+              </w:rPr>
+              <w:t>INSERTAR CAPTURA DE UNITY AQUI</w:t>
+            </w:r>
+          </w:p>
+          <w:p>
+            <w:pPr>
+              <w:spacing w:after="360"/>
+              <w:jc w:val="center"/>
+            </w:pPr>
+            <w:r>
+              <w:rPr>
+                <w:i/>
+                <w:color w:val="5A6972"/>
+                <w:sz w:val="18"/>
+              </w:rPr>
+              <w:t>Muestra el proyecto abierto desde la carpeta de trabajo y la version 6000.3.17f1.</w:t>
+            </w:r>
+          </w:p>
+        </w:tc>
+      </w:tr>
+    </w:tbl>
+    <w:p>
+      <w:pPr>
+        <w:spacing w:after="0"/>
+      </w:pPr>
+    </w:p>
+    <w:p>
+      <w:pPr>
+        <w:pStyle w:val="Heading2"/>
+        <w:keepNext/>
+        <w:spacing w:before="160" w:after="60"/>
+      </w:pPr>
+      <w:r>
+        <w:t>Captura 2. Escena TankRacing en modo de edicion</w:t>
+      </w:r>
+    </w:p>
+    <w:tbl>
+      <w:tblPr>
+        <w:tblW w:type="auto" w:w="0"/>
+        <w:jc w:val="center"/>
+        <w:tblLook w:firstColumn="1" w:firstRow="1" w:lastColumn="0" w:lastRow="0" w:noHBand="0" w:noVBand="1" w:val="04A0"/>
+      </w:tblPr>
+      <w:tblGrid>
+        <w:gridCol w:w="9994"/>
+      </w:tblGrid>
+      <w:tr>
+        <w:trPr>
+          <w:trHeight w:val="2131" w:hRule="atLeast"/>
+        </w:trPr>
+        <w:tc>
+          <w:tcPr>
+            <w:tcW w:type="dxa" w:w="9936"/>
+            <w:vAlign w:val="center"/>
+            <w:shd w:fill="F3F7F9"/>
+            <w:tcBorders>
+              <w:top w:val="single" w:sz="10" w:color="9DB2BF"/>
+              <w:left w:val="single" w:sz="10" w:color="9DB2BF"/>
+              <w:bottom w:val="single" w:sz="10" w:color="9DB2BF"/>
+              <w:right w:val="single" w:sz="10" w:color="9DB2BF"/>
+            </w:tcBorders>
+          </w:tcPr>
+          <w:p>
+            <w:pPr>
+              <w:spacing w:before="480" w:after="80"/>
+              <w:jc w:val="center"/>
+            </w:pPr>
+            <w:r>
+              <w:rPr>
+                <w:b/>
+                <w:color w:val="6E818C"/>
+                <w:sz w:val="22"/>
+              </w:rPr>
+              <w:t>INSERTAR CAPTURA DE UNITY AQUI</w:t>
+            </w:r>
+          </w:p>
+          <w:p>
+            <w:pPr>
+              <w:spacing w:after="360"/>
+              <w:jc w:val="center"/>
+            </w:pPr>
+            <w:r>
+              <w:rPr>
+                <w:i/>
+                <w:color w:val="5A6972"/>
+                <w:sz w:val="18"/>
+              </w:rPr>
+              <w:t>Muestra la ruta de nueve palmeras/waypoints, los cuatro tanques y la jerarquia.</w:t>
+            </w:r>
+          </w:p>
+        </w:tc>
+      </w:tr>
+    </w:tbl>
+    <w:p>
+      <w:pPr>
+        <w:spacing w:after="0"/>
+      </w:pPr>
+    </w:p>
+    <w:p>
+      <w:pPr>
+        <w:pStyle w:val="Heading2"/>
+        <w:keepNext/>
+        <w:spacing w:before="160" w:after="60"/>
+      </w:pPr>
+      <w:r>
+        <w:t>Captura 3. Inspector de FollowWP</w:t>
+      </w:r>
+    </w:p>
+    <w:tbl>
+      <w:tblPr>
+        <w:tblW w:type="auto" w:w="0"/>
+        <w:jc w:val="center"/>
+        <w:tblLook w:firstColumn="1" w:firstRow="1" w:lastColumn="0" w:lastRow="0" w:noHBand="0" w:noVBand="1" w:val="04A0"/>
+      </w:tblPr>
+      <w:tblGrid>
+        <w:gridCol w:w="9994"/>
+      </w:tblGrid>
+      <w:tr>
+        <w:trPr>
+          <w:trHeight w:val="2131" w:hRule="atLeast"/>
+        </w:trPr>
+        <w:tc>
+          <w:tcPr>
+            <w:tcW w:type="dxa" w:w="9936"/>
+            <w:vAlign w:val="center"/>
+            <w:shd w:fill="F3F7F9"/>
+            <w:tcBorders>
+              <w:top w:val="single" w:sz="10" w:color="9DB2BF"/>
+              <w:left w:val="single" w:sz="10" w:color="9DB2BF"/>
+              <w:bottom w:val="single" w:sz="10" w:color="9DB2BF"/>
+              <w:right w:val="single" w:sz="10" w:color="9DB2BF"/>
+            </w:tcBorders>
+          </w:tcPr>
+          <w:p>
+            <w:pPr>
+              <w:spacing w:before="480" w:after="80"/>
+              <w:jc w:val="center"/>
+            </w:pPr>
+            <w:r>
+              <w:rPr>
+                <w:b/>
+                <w:color w:val="6E818C"/>
+                <w:sz w:val="22"/>
+              </w:rPr>
+              <w:t>INSERTAR CAPTURA DE UNITY AQUI</w:t>
+            </w:r>
+          </w:p>
+          <w:p>
+            <w:pPr>
+              <w:spacing w:after="360"/>
+              <w:jc w:val="center"/>
+            </w:pPr>
+            <w:r>
+              <w:rPr>
+                <w:i/>
+                <w:color w:val="5A6972"/>
+                <w:sz w:val="18"/>
+              </w:rPr>
+              <w:t>Muestra un tanque seleccionado y sus nueve referencias, velocidad, giro, radio y carril.</w:t>
+            </w:r>
+          </w:p>
+        </w:tc>
+      </w:tr>
+    </w:tbl>
+    <w:p>
+      <w:pPr>
+        <w:spacing w:after="0"/>
+      </w:pPr>
+    </w:p>
+    <w:p>
+      <w:pPr>
+        <w:pStyle w:val="Heading2"/>
+        <w:keepNext/>
+        <w:spacing w:before="160" w:after="60"/>
+      </w:pPr>
+      <w:r>
+        <w:t>Captura 4. Escena CarCircuit sin Play</w:t>
+      </w:r>
+    </w:p>
+    <w:tbl>
+      <w:tblPr>
+        <w:tblW w:type="auto" w:w="0"/>
+        <w:jc w:val="center"/>
+        <w:tblLook w:firstColumn="1" w:firstRow="1" w:lastColumn="0" w:lastRow="0" w:noHBand="0" w:noVBand="1" w:val="04A0"/>
+      </w:tblPr>
+      <w:tblGrid>
+        <w:gridCol w:w="9994"/>
+      </w:tblGrid>
+      <w:tr>
+        <w:trPr>
+          <w:trHeight w:val="2131" w:hRule="atLeast"/>
+        </w:trPr>
+        <w:tc>
+          <w:tcPr>
+            <w:tcW w:type="dxa" w:w="9936"/>
+            <w:vAlign w:val="center"/>
+            <w:shd w:fill="F3F7F9"/>
+            <w:tcBorders>
+              <w:top w:val="single" w:sz="10" w:color="9DB2BF"/>
+              <w:left w:val="single" w:sz="10" w:color="9DB2BF"/>
+              <w:bottom w:val="single" w:sz="10" w:color="9DB2BF"/>
+              <w:right w:val="single" w:sz="10" w:color="9DB2BF"/>
+            </w:tcBorders>
+          </w:tcPr>
+          <w:p>
+            <w:pPr>
+              <w:spacing w:before="480" w:after="80"/>
+              <w:jc w:val="center"/>
+            </w:pPr>
+            <w:r>
+              <w:rPr>
+                <w:b/>
+                <w:color w:val="6E818C"/>
+                <w:sz w:val="22"/>
+              </w:rPr>
+              <w:t>INSERTAR CAPTURA DE UNITY AQUI</w:t>
+            </w:r>
+          </w:p>
+          <w:p>
+            <w:pPr>
+              <w:spacing w:after="360"/>
+              <w:jc w:val="center"/>
+            </w:pPr>
+            <w:r>
+              <w:rPr>
+                <w:i/>
+                <w:color w:val="5A6972"/>
+                <w:sz w:val="18"/>
+              </w:rPr>
+              <w:t>Muestra el circuito completo, los autos, puntos, decoracion, barreras y jerarquia generada.</w:t>
+            </w:r>
+          </w:p>
+        </w:tc>
+      </w:tr>
+    </w:tbl>
+    <w:p>
+      <w:pPr>
+        <w:spacing w:after="0"/>
+      </w:pPr>
+    </w:p>
+    <w:p>
+      <w:pPr>
+        <w:pStyle w:val="Heading2"/>
+        <w:keepNext/>
+        <w:spacing w:before="160" w:after="60"/>
+      </w:pPr>
+      <w:r>
+        <w:t>Captura 5. Inspector de fisica y colisiones</w:t>
+      </w:r>
+    </w:p>
+    <w:tbl>
+      <w:tblPr>
+        <w:tblW w:type="auto" w:w="0"/>
+        <w:jc w:val="center"/>
+        <w:tblLook w:firstColumn="1" w:firstRow="1" w:lastColumn="0" w:lastRow="0" w:noHBand="0" w:noVBand="1" w:val="04A0"/>
+      </w:tblPr>
+      <w:tblGrid>
+        <w:gridCol w:w="9994"/>
+      </w:tblGrid>
+      <w:tr>
+        <w:trPr>
+          <w:trHeight w:val="2131" w:hRule="atLeast"/>
+        </w:trPr>
+        <w:tc>
+          <w:tcPr>
+            <w:tcW w:type="dxa" w:w="9936"/>
+            <w:vAlign w:val="center"/>
+            <w:shd w:fill="F3F7F9"/>
+            <w:tcBorders>
+              <w:top w:val="single" w:sz="10" w:color="9DB2BF"/>
+              <w:left w:val="single" w:sz="10" w:color="9DB2BF"/>
+              <w:bottom w:val="single" w:sz="10" w:color="9DB2BF"/>
+              <w:right w:val="single" w:sz="10" w:color="9DB2BF"/>
+            </w:tcBorders>
+          </w:tcPr>
+          <w:p>
+            <w:pPr>
+              <w:spacing w:before="480" w:after="80"/>
+              <w:jc w:val="center"/>
+            </w:pPr>
+            <w:r>
+              <w:rPr>
+                <w:b/>
+                <w:color w:val="6E818C"/>
+                <w:sz w:val="22"/>
+              </w:rPr>
+              <w:t>INSERTAR CAPTURA DE UNITY AQUI</w:t>
+            </w:r>
+          </w:p>
+          <w:p>
+            <w:pPr>
+              <w:spacing w:after="360"/>
+              <w:jc w:val="center"/>
+            </w:pPr>
+            <w:r>
+              <w:rPr>
+                <w:i/>
+                <w:color w:val="5A6972"/>
+                <w:sz w:val="18"/>
+              </w:rPr>
+              <w:t>Muestra el MeshCollider de pista, un Rigidbody/BoxCollider de auto y el trigger de meta.</w:t>
+            </w:r>
+          </w:p>
+        </w:tc>
+      </w:tr>
+    </w:tbl>
+    <w:p>
+      <w:pPr>
+        <w:spacing w:after="0"/>
+      </w:pPr>
+    </w:p>
+    <w:p>
+      <w:pPr>
+        <w:pStyle w:val="Heading2"/>
+        <w:keepNext/>
+        <w:spacing w:before="160" w:after="60"/>
+      </w:pPr>
+      <w:r>
+        <w:t>Captura 6. Panel UGUI de navegacion</w:t>
+      </w:r>
+    </w:p>
+    <w:tbl>
+      <w:tblPr>
+        <w:tblW w:type="auto" w:w="0"/>
+        <w:jc w:val="center"/>
+        <w:tblLook w:firstColumn="1" w:firstRow="1" w:lastColumn="0" w:lastRow="0" w:noHBand="0" w:noVBand="1" w:val="04A0"/>
+      </w:tblPr>
+      <w:tblGrid>
+        <w:gridCol w:w="9994"/>
+      </w:tblGrid>
+      <w:tr>
+        <w:trPr>
+          <w:trHeight w:val="2131" w:hRule="atLeast"/>
+        </w:trPr>
+        <w:tc>
+          <w:tcPr>
+            <w:tcW w:type="dxa" w:w="9936"/>
+            <w:vAlign w:val="center"/>
+            <w:shd w:fill="F3F7F9"/>
+            <w:tcBorders>
+              <w:top w:val="single" w:sz="10" w:color="9DB2BF"/>
+              <w:left w:val="single" w:sz="10" w:color="9DB2BF"/>
+              <w:bottom w:val="single" w:sz="10" w:color="9DB2BF"/>
+              <w:right w:val="single" w:sz="10" w:color="9DB2BF"/>
+            </w:tcBorders>
+          </w:tcPr>
+          <w:p>
+            <w:pPr>
+              <w:spacing w:before="480" w:after="80"/>
+              <w:jc w:val="center"/>
+            </w:pPr>
+            <w:r>
+              <w:rPr>
+                <w:b/>
+                <w:color w:val="6E818C"/>
+                <w:sz w:val="22"/>
+              </w:rPr>
+              <w:t>INSERTAR CAPTURA DE UNITY AQUI</w:t>
+            </w:r>
+          </w:p>
+          <w:p>
+            <w:pPr>
+              <w:spacing w:after="360"/>
+              <w:jc w:val="center"/>
+            </w:pPr>
+            <w:r>
+              <w:rPr>
+                <w:i/>
+                <w:color w:val="5A6972"/>
+                <w:sz w:val="18"/>
+              </w:rPr>
+              <w:t>Muestra los controles para cambiar de escena, seleccionar vehiculo y alternar waypoints/tracker.</w:t>
+            </w:r>
+          </w:p>
+        </w:tc>
+      </w:tr>
+    </w:tbl>
+    <w:p>
+      <w:pPr>
+        <w:spacing w:after="0"/>
+      </w:pPr>
+    </w:p>
+    <w:p>
+      <w:pPr>
+        <w:pStyle w:val="Heading2"/>
+        <w:keepNext/>
+        <w:spacing w:before="160" w:after="60"/>
+      </w:pPr>
+      <w:r>
+        <w:t>Captura 7. Ejecucion Play y movimiento</w:t>
+      </w:r>
+    </w:p>
+    <w:tbl>
+      <w:tblPr>
+        <w:tblW w:type="auto" w:w="0"/>
+        <w:jc w:val="center"/>
+        <w:tblLook w:firstColumn="1" w:firstRow="1" w:lastColumn="0" w:lastRow="0" w:noHBand="0" w:noVBand="1" w:val="04A0"/>
+      </w:tblPr>
+      <w:tblGrid>
+        <w:gridCol w:w="9994"/>
+      </w:tblGrid>
+      <w:tr>
+        <w:trPr>
+          <w:trHeight w:val="2131" w:hRule="atLeast"/>
+        </w:trPr>
+        <w:tc>
+          <w:tcPr>
+            <w:tcW w:type="dxa" w:w="9936"/>
+            <w:vAlign w:val="center"/>
+            <w:shd w:fill="F3F7F9"/>
+            <w:tcBorders>
+              <w:top w:val="single" w:sz="10" w:color="9DB2BF"/>
+              <w:left w:val="single" w:sz="10" w:color="9DB2BF"/>
+              <w:bottom w:val="single" w:sz="10" w:color="9DB2BF"/>
+              <w:right w:val="single" w:sz="10" w:color="9DB2BF"/>
+            </w:tcBorders>
+          </w:tcPr>
+          <w:p>
+            <w:pPr>
+              <w:spacing w:before="480" w:after="80"/>
+              <w:jc w:val="center"/>
+            </w:pPr>
+            <w:r>
+              <w:rPr>
+                <w:b/>
+                <w:color w:val="6E818C"/>
+                <w:sz w:val="22"/>
+              </w:rPr>
+              <w:t>INSERTAR CAPTURA DE UNITY AQUI</w:t>
+            </w:r>
+          </w:p>
+          <w:p>
+            <w:pPr>
+              <w:spacing w:after="360"/>
+              <w:jc w:val="center"/>
+            </w:pPr>
+            <w:r>
+              <w:rPr>
+                <w:i/>
+                <w:color w:val="5A6972"/>
+                <w:sz w:val="18"/>
+              </w:rPr>
+              <w:t>Espacio reservado para evidencia de la ruta recorriendose cuando la licencia permita ejecutar Unity.</w:t>
+            </w:r>
+          </w:p>
+        </w:tc>
+      </w:tr>
+    </w:tbl>
+    <w:p>
+      <w:pPr>
+        <w:spacing w:after="0"/>
+      </w:pPr>
+    </w:p>
+    <w:p>
+      <w:pPr>
+        <w:pStyle w:val="Heading2"/>
+        <w:keepNext/>
+        <w:spacing w:before="160" w:after="60"/>
+      </w:pPr>
+      <w:r>
+        <w:t>Captura 8. Colision y conteo de vueltas</w:t>
+      </w:r>
+    </w:p>
+    <w:tbl>
+      <w:tblPr>
+        <w:tblW w:type="auto" w:w="0"/>
+        <w:jc w:val="center"/>
+        <w:tblLook w:firstColumn="1" w:firstRow="1" w:lastColumn="0" w:lastRow="0" w:noHBand="0" w:noVBand="1" w:val="04A0"/>
+      </w:tblPr>
+      <w:tblGrid>
+        <w:gridCol w:w="9994"/>
+      </w:tblGrid>
+      <w:tr>
+        <w:trPr>
+          <w:trHeight w:val="2131" w:hRule="atLeast"/>
+        </w:trPr>
+        <w:tc>
+          <w:tcPr>
+            <w:tcW w:type="dxa" w:w="9936"/>
+            <w:vAlign w:val="center"/>
+            <w:shd w:fill="F3F7F9"/>
+            <w:tcBorders>
+              <w:top w:val="single" w:sz="10" w:color="9DB2BF"/>
+              <w:left w:val="single" w:sz="10" w:color="9DB2BF"/>
+              <w:bottom w:val="single" w:sz="10" w:color="9DB2BF"/>
+              <w:right w:val="single" w:sz="10" w:color="9DB2BF"/>
+            </w:tcBorders>
+          </w:tcPr>
+          <w:p>
+            <w:pPr>
+              <w:spacing w:before="480" w:after="80"/>
+              <w:jc w:val="center"/>
+            </w:pPr>
+            <w:r>
+              <w:rPr>
+                <w:b/>
+                <w:color w:val="6E818C"/>
+                <w:sz w:val="22"/>
+              </w:rPr>
+              <w:t>INSERTAR CAPTURA DE UNITY AQUI</w:t>
+            </w:r>
+          </w:p>
+          <w:p>
+            <w:pPr>
+              <w:spacing w:after="360"/>
+              <w:jc w:val="center"/>
+            </w:pPr>
+            <w:r>
+              <w:rPr>
+                <w:i/>
+                <w:color w:val="5A6972"/>
+                <w:sz w:val="18"/>
+              </w:rPr>
+              <w:t>Espacio reservado para evidencia del contacto con barreras y del contador al cruzar la meta.</w:t>
+            </w:r>
+          </w:p>
+        </w:tc>
+      </w:tr>
+    </w:tbl>
+    <w:p>
+      <w:pPr>
+        <w:spacing w:after="0"/>
+      </w:pPr>
+    </w:p>
+    <w:p>
+      <w:pPr>
+        <w:pStyle w:val="Heading1"/>
+        <w:keepNext/>
+      </w:pPr>
+      <w:r>
+        <w:t>9. Conclusiones</w:t>
+      </w:r>
+    </w:p>
+    <w:p>
+      <w:r>
+        <w:t>El proyecto integra el seguimiento por waypoints en el escenario original y extiende la tecnica a una carrera de autos. La ruta de tanques permite modificar sus referencias y parametros desde el Inspector. La escena de autos hace visible el circuito y su jerarquia en modo de edicion, incluye colisiones en la pista y vehiculos, y ofrece dos metodos de seguimiento desde el panel. La interfaz permite pasar de una escena a otra y navegar por los vehiculos.</w:t>
+      </w:r>
+    </w:p>
+    <w:p>
+      <w:r>
+        <w:t xml:space="preserve">La evidencia tecnica disponible confirma que los scripts compilan en las variantes runtime y Editor, y que </w:t>
+      </w:r>
+      <w:r>
+        <w:rPr>
+          <w:rFonts w:ascii="Consolas" w:hAnsi="Consolas"/>
+          <w:color w:val="245B7A"/>
+          <w:sz w:val="19"/>
+        </w:rPr>
+        <w:t>TankRacing</w:t>
+      </w:r>
+      <w:r>
+        <w:t xml:space="preserve"> contiene las referencias serializadas previstas. </w:t>
+      </w:r>
+      <w:r>
+        <w:rPr>
+          <w:rFonts w:ascii="Consolas" w:hAnsi="Consolas"/>
+          <w:color w:val="245B7A"/>
+          <w:sz w:val="19"/>
+        </w:rPr>
+        <w:t>CarCircuit</w:t>
+      </w:r>
+      <w:r>
+        <w:t xml:space="preserve"> contiene el componente constructor y su vista previa se produce al abrirla en el Editor. La comprobacion visual e interactiva en Play queda condicionada a que Unity Licensing permita abrir el Editor. Las capturas reservadas permiten completar esa parte del informe sin atribuirse resultados que no se pudieron observar.</w:t>
+      </w:r>
+    </w:p>
+    <w:p>
+      <w:pPr>
+        <w:pStyle w:val="Heading1"/>
+        <w:keepNext/>
+      </w:pPr>
+      <w:r>
+        <w:t>10. Referencias</w:t>
       </w:r>
     </w:p>
     <w:p>
@@ -1022,16 +2338,17 @@
         <w:pStyle w:val="ListBullet"/>
       </w:pPr>
       <w:r>
-        <w:t xml:space="preserve">Unity Learn, </w:t>
+        <w:t xml:space="preserve">Unity Learn. </w:t>
       </w:r>
-      <w:r>
-        <w:rPr>
-          <w:color w:val="245B7A"/>
-          <w:sz w:val="20"/>
-          <w:u w:val="single"/>
-        </w:rPr>
-        <w:t>Waypoints</w:t>
-      </w:r>
+      <w:hyperlink r:id="rId10">
+        <w:r>
+          <w:rPr>
+            <w:color w:val="245B7A"/>
+            <w:u w:val="single"/>
+          </w:rPr>
+          <w:t>Waypoints</w:t>
+        </w:r>
+      </w:hyperlink>
       <w:r>
         <w:t>.</w:t>
       </w:r>
@@ -1041,16 +2358,37 @@
         <w:pStyle w:val="ListBullet"/>
       </w:pPr>
       <w:r>
-        <w:t xml:space="preserve">Unity Learn, </w:t>
+        <w:t xml:space="preserve">Unity Learn. </w:t>
       </w:r>
+      <w:hyperlink r:id="rId11">
+        <w:r>
+          <w:rPr>
+            <w:color w:val="245B7A"/>
+            <w:u w:val="single"/>
+          </w:rPr>
+          <w:t>Following a Circuit &amp; Tracker</w:t>
+        </w:r>
+      </w:hyperlink>
       <w:r>
-        <w:rPr>
-          <w:color w:val="245B7A"/>
-          <w:sz w:val="20"/>
-          <w:u w:val="single"/>
-        </w:rPr>
-        <w:t>Following a Circuit &amp; Tracker</w:t>
+        <w:t>.</w:t>
       </w:r>
+    </w:p>
+    <w:p>
+      <w:pPr>
+        <w:pStyle w:val="ListBullet"/>
+      </w:pPr>
+      <w:r>
+        <w:t xml:space="preserve">Unity Technologies. </w:t>
+      </w:r>
+      <w:hyperlink r:id="rId12">
+        <w:r>
+          <w:rPr>
+            <w:color w:val="245B7A"/>
+            <w:u w:val="single"/>
+          </w:rPr>
+          <w:t>Input System package 1.17.0</w:t>
+        </w:r>
+      </w:hyperlink>
       <w:r>
         <w:t>.</w:t>
       </w:r>

</xml_diff>

<commit_message>
Polish LAB06 game menu and drivable car race
</commit_message>
<xml_diff>
--- a/Assets/Documentation/Informe_Laboratorio_06_Waypoints.docx
+++ b/Assets/Documentation/Informe_Laboratorio_06_Waypoints.docx
@@ -75,32 +75,7 @@
     </w:p>
     <w:p>
       <w:r>
-        <w:rPr>
-          <w:b/>
-        </w:rPr>
-        <w:t>Escenas:</w:t>
-      </w:r>
-      <w:r>
-        <w:t xml:space="preserve"> </w:t>
-      </w:r>
-      <w:r>
-        <w:rPr>
-          <w:rFonts w:ascii="Consolas" w:hAnsi="Consolas"/>
-          <w:color w:val="245B7A"/>
-          <w:sz w:val="19"/>
-        </w:rPr>
-        <w:t>Assets/Scenes/TankRacing.unity</w:t>
-      </w:r>
-      <w:r>
-        <w:t xml:space="preserve"> y </w:t>
-      </w:r>
-      <w:r>
-        <w:rPr>
-          <w:rFonts w:ascii="Consolas" w:hAnsi="Consolas"/>
-          <w:color w:val="245B7A"/>
-          <w:sz w:val="19"/>
-        </w:rPr>
-        <w:t>Assets/Scenes/CarCircuit.unity</w:t>
+        <w:t>Escenas: Assets/Scenes/MainMenu.unity, Assets/Scenes/TankRacing.unity y Assets/Scenes/CarCircuit.unity</w:t>
       </w:r>
     </w:p>
     <w:p>
@@ -158,12 +133,12 @@
     </w:p>
     <w:p>
       <w:r>
-        <w:t>Este informe documenta la implementacion del Laboratorio 06 sobre navegacion mediante waypoints y seguimiento de circuitos. El proyecto Unity contiene la escena de tanques del starter con nueve puntos ordenados y cuatro agentes configurados; tambien incorpora un circuito costero de carreras con quince waypoints, cuatro autos, superficie y barreras con colision, conteo de vueltas, seguimiento directo y seguimiento de un tracker movil. El escenario de autos se genera en el modo de edicion al abrir la escena, para que su geometria, jerarquia, puntos y componentes puedan inspeccionarse sin entrar en Play. Ambas escenas incluyen un panel para cambiar de escena, enfocar vehiculos y controlar el modo de movimiento.</w:t>
+        <w:t>Este informe documenta la implementacion del Laboratorio 06 sobre navegacion mediante waypoints y seguimiento de circuitos. El proyecto abre con un menu para elegir por separado el circuito de tanques o la carrera de autos. La escena TankRacing contiene nueve puntos ordenados y cuatro agentes; la carrera costera incorpora quince waypoints, un auto controlable, tres rivales, colisiones, conteo de vueltas y seguimiento directo o mediante tracker. El circuito se inspecciona sin iniciar Play; al ejecutar, el HUD presenta los controles y permite cambiar de metodo o volver al selector.</w:t>
       </w:r>
     </w:p>
     <w:p>
       <w:r>
-        <w:t>Los scripts compilaron con las bibliotecas del Editor objetivo y se revisaron las referencias serializadas de la escena de tanques. No se pudo completar una prueba visual de Play en esta sesion porque Unity Licensing rechazo la conexion de License Client. Por tanto, se describe por separado la implementacion comprobada estaticamente y la prueba interactiva que queda por registrar en las capturas.</w:t>
+        <w:t>Los scripts runtime compilaron con las bibliotecas y paquetes de Unity 6 6000.3.17f1; tambien se revisaron las referencias serializadas de TankRacing y la estructura del selector y el HUD. La compilacion externa no sustituye una prueba interactiva. Esta sesion no obtuvo una ventana de Unity controlable ni una corrida completa del juego, asi que los resultados de movimiento y clics se identifican como pendientes de evidencia.</w:t>
       </w:r>
     </w:p>
     <w:p>
@@ -216,40 +191,7 @@
     </w:p>
     <w:p>
       <w:r>
-        <w:t xml:space="preserve">El Editor objetivo es Unity 6 </w:t>
-      </w:r>
-      <w:r>
-        <w:rPr>
-          <w:rFonts w:ascii="Consolas" w:hAnsi="Consolas"/>
-          <w:color w:val="245B7A"/>
-          <w:sz w:val="19"/>
-        </w:rPr>
-        <w:t>6000.3.17f1</w:t>
-      </w:r>
-      <w:r>
-        <w:t xml:space="preserve">. La escena de tanques preserva el contenido base y agrega la ruta y sus seguidores. La escena </w:t>
-      </w:r>
-      <w:r>
-        <w:rPr>
-          <w:rFonts w:ascii="Consolas" w:hAnsi="Consolas"/>
-          <w:color w:val="245B7A"/>
-          <w:sz w:val="19"/>
-        </w:rPr>
-        <w:t>CarCircuit</w:t>
-      </w:r>
-      <w:r>
-        <w:t xml:space="preserve"> incluye un constructor de vista previa en modo edicion (</w:t>
-      </w:r>
-      <w:r>
-        <w:rPr>
-          <w:rFonts w:ascii="Consolas" w:hAnsi="Consolas"/>
-          <w:color w:val="245B7A"/>
-          <w:sz w:val="19"/>
-        </w:rPr>
-        <w:t>ExecuteAlways</w:t>
-      </w:r>
-      <w:r>
-        <w:t>): al abrirla, la jerarquia se completa con la pista, los waypoints, los autos, las barreras, la meta y la interfaz. El Editor guarda esos objetos en la escena al completar la vista previa. La ejecucion de ese paso requiere que Unity importe los scripts y el paquete Input System; en esta sesion no se pudo abrir el Editor para confirmar la vista final por el rechazo de Unity Licensing.</w:t>
+        <w:t>El Editor objetivo es Unity 6 6000.3.17f1. Build Settings inicia en MainMenu, que contiene opciones independientes para TankRacing y CarCircuit. La escena de tanques conserva el contenido base y agrega la ruta y sus seguidores. CarCircuit construye y guarda su vista previa en modo de edicion (ExecuteAlways), mostrando pista, waypoints, autos, barreras, meta e interfaz sin Play. El paquete Input System proporciona las entradas del juego y los eventos de interfaz.</w:t>
       </w:r>
     </w:p>
     <w:p>
@@ -1432,40 +1374,7 @@
     </w:p>
     <w:p>
       <w:r>
-        <w:t xml:space="preserve">En el modo directo, cada auto usa </w:t>
-      </w:r>
-      <w:r>
-        <w:rPr>
-          <w:rFonts w:ascii="Consolas" w:hAnsi="Consolas"/>
-          <w:color w:val="245B7A"/>
-          <w:sz w:val="19"/>
-        </w:rPr>
-        <w:t>FollowWP</w:t>
-      </w:r>
-      <w:r>
-        <w:t xml:space="preserve"> para seguir la lista ordenada. En el modo tracker, </w:t>
-      </w:r>
-      <w:r>
-        <w:rPr>
-          <w:rFonts w:ascii="Consolas" w:hAnsi="Consolas"/>
-          <w:color w:val="245B7A"/>
-          <w:sz w:val="19"/>
-        </w:rPr>
-        <w:t>CircuitTracker</w:t>
-      </w:r>
-      <w:r>
-        <w:t xml:space="preserve"> recorre la ruta suavizada y </w:t>
-      </w:r>
-      <w:r>
-        <w:rPr>
-          <w:rFonts w:ascii="Consolas" w:hAnsi="Consolas"/>
-          <w:color w:val="245B7A"/>
-          <w:sz w:val="19"/>
-        </w:rPr>
-        <w:t>FollowTracker</w:t>
-      </w:r>
-      <w:r>
-        <w:t xml:space="preserve"> persigue la posicion movil manteniendo una distancia. El panel de navegacion permite alternar entre los dos metodos mientras la escena esta en Play. El tracker y sus componentes permanecen en la escena para que puedan inspeccionarse antes de ejecutar.</w:t>
+        <w:t>En el modo directo, los rivales usan FollowWP para seguir la lista ordenada. En el modo tracker, CircuitTracker recorre la ruta suavizada y FollowTracker persigue la posicion movil. El boton del HUD permite comparar los metodos en Play; Azure sigue bajo control del jugador en ambos. Los rivales reducen velocidad en las curvas para disminuir los recortes sobre otros carriles.</w:t>
       </w:r>
     </w:p>
     <w:p>
@@ -1479,7 +1388,7 @@
     </w:p>
     <w:p>
       <w:r>
-        <w:t>Las dos escenas incluyen un panel UGUI configurado como Screen Space Overlay y visible en Game incluso cuando el Editor no esta en Play. Incluye botones para cambiar entre la escena de tanques y la de autos, avanzar o retroceder entre vehiculos, enfocar el vehiculo seleccionado, volver a la vista general y cambiar el modo de movimiento en la carrera. En la escena de autos tambien muestra vueltas completadas. La generacion visual y la interaccion de botones quedan pendientes de comprobar en el Editor.</w:t>
+        <w:t>El selector dedicado muestra dos tarjetas: Modo tanques y Carrera de autos. Cada circuito contiene un HUD compacto con controles, velocidad, selector waypoint/tracker, camara de seguimiento o vista general, botones para cambiar de escena y retorno al selector. Los botones se enlazan al iniciar Play y se crea el EventSystem con InputSystemUIInputModule. La fuente LegacyRuntime.ttf es compatible con Unity 6 y corrige la excepcion que detenia la generacion de textos, causa de que antes solo apareciera el titulo.</w:t>
       </w:r>
     </w:p>
     <w:p>
@@ -1507,7 +1416,7 @@
     </w:p>
     <w:p>
       <w:r>
-        <w:t>Se implementan los dos enfoques descritos por el tutorial: seguidores que recorren waypoints directamente y seguidores que persiguen un tracker movil. La escena de autos hace observable la comparacion mediante el boton de modo del panel. El tracker se desplaza sobre una curva suavizada; cada auto conserva su controlador directo para que el cambio de modo no requiera reconfigurar la escena.</w:t>
+        <w:t>Se implementan los dos enfoques del tutorial: los rivales recorren waypoints directamente o persiguen un tracker movil sobre una curva suavizada. El HUD cambia entre ellos durante Play. El usuario conduce Azure con WASD o las flechas; la barra espaciadora activa el freno de mano.</w:t>
       </w:r>
     </w:p>
     <w:p>
@@ -1521,7 +1430,7 @@
     </w:p>
     <w:p>
       <w:r>
-        <w:t>Se agrego una escena independiente con una pista cerrada, marcaciones de borde, pianos, barreras, meta, garages, graderia, palmeras y cuatro autos. La pista y los obstaculos relevantes tienen colisionadores. Los vehiculos tienen fisica y siguen el circuito. El escenario puede inspeccionarse en el Editor sin Play y navegarse con el panel cuando se ejecuta.</w:t>
+        <w:t>Se agrego una escena independiente con pista cerrada, marcaciones, pianos, barreras, meta, garages, graderia, palmeras y cuatro autos. La pista y los obstaculos tienen colliders. El jugador conduce un auto y tres rivales siguen carriles separados, reduciendo velocidad en curvas. La escena se inspecciona sin Play y se alcanza desde la tarjeta Carrera de autos.</w:t>
       </w:r>
     </w:p>
     <w:p>
@@ -1641,18 +1550,7 @@
         <w:pStyle w:val="ListBullet"/>
       </w:pPr>
       <w:r>
-        <w:t xml:space="preserve">Compilacion de todos los scripts runtime y de los bloques de Editor con las bibliotecas de Unity </w:t>
-      </w:r>
-      <w:r>
-        <w:rPr>
-          <w:rFonts w:ascii="Consolas" w:hAnsi="Consolas"/>
-          <w:color w:val="245B7A"/>
-          <w:sz w:val="19"/>
-        </w:rPr>
-        <w:t>6000.3.17f1</w:t>
-      </w:r>
-      <w:r>
-        <w:t>.</w:t>
+        <w:t>Compilacion externa de todos los scripts runtime con las referencias de Unity 6000.3.17f1, incluida la UI, Input System y VehiclesModule.</w:t>
       </w:r>
     </w:p>
     <w:p>
@@ -1681,24 +1579,7 @@
     </w:p>
     <w:p>
       <w:r>
-        <w:rPr>
-          <w:b/>
-        </w:rPr>
-        <w:t>Prueba pendiente:</w:t>
-      </w:r>
-      <w:r>
-        <w:t xml:space="preserve"> Unity Licensing rechazo la conexion a </w:t>
-      </w:r>
-      <w:r>
-        <w:rPr>
-          <w:rFonts w:ascii="Consolas" w:hAnsi="Consolas"/>
-          <w:color w:val="245B7A"/>
-          <w:sz w:val="19"/>
-        </w:rPr>
-        <w:t>LicenseClient</w:t>
-      </w:r>
-      <w:r>
-        <w:t xml:space="preserve"> al iniciar el Editor en esta sesion. Por eso no se pudo abrir Play y comprobar visualmente el movimiento, las colisiones, el cambio de escenas, el enfoque de camara y el contador de vueltas. No se presentan esas acciones como probadas. Al completar esa ejecucion, agrega las capturas correspondientes en los espacios de la seccion 8.</w:t>
+        <w:t>Prueba pendiente: Unity resolvio el entitlement de Unity Personal en un log previo, pero el proceso iniciado para esta verificacion no proporciono una ventana controlable. No pude confirmar en vivo los clics, movimiento, colisiones ni vueltas. No presento esas acciones como probadas. Abre MainMenu o pulsa Play y agrega evidencia real en los espacios de la seccion 8.</w:t>
       </w:r>
     </w:p>
     <w:p>
@@ -1783,8 +1664,17 @@
     </w:tbl>
     <w:p>
       <w:pPr>
-        <w:spacing w:after="0"/>
+        <w:spacing w:after="280" w:before="200"/>
+        <w:jc w:val="center"/>
       </w:pPr>
+      <w:r>
+        <w:rPr>
+          <w:i/>
+          <w:color w:val="647078"/>
+          <w:sz w:val="20"/>
+        </w:rPr>
+        <w:t>ESPACIO PARA CAPTURA: Proyecto abierto en Unity Hub con la version del Editor visible.</w:t>
+      </w:r>
     </w:p>
     <w:p>
       <w:pPr>
@@ -1854,8 +1744,17 @@
     </w:tbl>
     <w:p>
       <w:pPr>
-        <w:spacing w:after="0"/>
+        <w:spacing w:after="280" w:before="200"/>
+        <w:jc w:val="center"/>
       </w:pPr>
+      <w:r>
+        <w:rPr>
+          <w:i/>
+          <w:color w:val="647078"/>
+          <w:sz w:val="20"/>
+        </w:rPr>
+        <w:t>ESPACIO PARA CAPTURA: Cuatro tanques y los nueve waypoints visibles, sin entrar en Play.</w:t>
+      </w:r>
     </w:p>
     <w:p>
       <w:pPr>
@@ -1925,8 +1824,17 @@
     </w:tbl>
     <w:p>
       <w:pPr>
-        <w:spacing w:after="0"/>
+        <w:spacing w:after="280" w:before="200"/>
+        <w:jc w:val="center"/>
       </w:pPr>
+      <w:r>
+        <w:rPr>
+          <w:i/>
+          <w:color w:val="647078"/>
+          <w:sz w:val="20"/>
+        </w:rPr>
+        <w:t>ESPACIO PARA CAPTURA: Componente FollowWP con su lista ordenada de nueve puntos.</w:t>
+      </w:r>
     </w:p>
     <w:p>
       <w:pPr>
@@ -1996,8 +1904,17 @@
     </w:tbl>
     <w:p>
       <w:pPr>
-        <w:spacing w:after="0"/>
+        <w:spacing w:after="280" w:before="200"/>
+        <w:jc w:val="center"/>
       </w:pPr>
+      <w:r>
+        <w:rPr>
+          <w:i/>
+          <w:color w:val="647078"/>
+          <w:sz w:val="20"/>
+        </w:rPr>
+        <w:t>ESPACIO PARA CAPTURA: Circuito Costa Azul completo en modo de edicion.</w:t>
+      </w:r>
     </w:p>
     <w:p>
       <w:pPr>
@@ -2067,8 +1984,17 @@
     </w:tbl>
     <w:p>
       <w:pPr>
-        <w:spacing w:after="0"/>
+        <w:spacing w:after="280" w:before="200"/>
+        <w:jc w:val="center"/>
       </w:pPr>
+      <w:r>
+        <w:rPr>
+          <w:i/>
+          <w:color w:val="647078"/>
+          <w:sz w:val="20"/>
+        </w:rPr>
+        <w:t>ESPACIO PARA CAPTURA: Inspector con MeshCollider, Rigidbody, BoxCollider y meta trigger.</w:t>
+      </w:r>
     </w:p>
     <w:p>
       <w:pPr>
@@ -2077,7 +2003,7 @@
         <w:spacing w:before="160" w:after="60"/>
       </w:pPr>
       <w:r>
-        <w:t>Captura 6. Panel UGUI de navegacion</w:t>
+        <w:t>Captura 6. Menu de seleccion de modo</w:t>
       </w:r>
     </w:p>
     <w:tbl>
@@ -2138,8 +2064,17 @@
     </w:tbl>
     <w:p>
       <w:pPr>
-        <w:spacing w:after="0"/>
+        <w:spacing w:after="280" w:before="200"/>
+        <w:jc w:val="center"/>
       </w:pPr>
+      <w:r>
+        <w:rPr>
+          <w:i/>
+          <w:color w:val="647078"/>
+          <w:sz w:val="20"/>
+        </w:rPr>
+        <w:t>ESPACIO PARA CAPTURA: Selector de modos con las opciones Tanques y Carrera.</w:t>
+      </w:r>
     </w:p>
     <w:p>
       <w:pPr>
@@ -2148,7 +2083,7 @@
         <w:spacing w:before="160" w:after="60"/>
       </w:pPr>
       <w:r>
-        <w:t>Captura 7. Ejecucion Play y movimiento</w:t>
+        <w:t>Captura 7. Auto controlado en Play</w:t>
       </w:r>
     </w:p>
     <w:tbl>
@@ -2209,8 +2144,17 @@
     </w:tbl>
     <w:p>
       <w:pPr>
-        <w:spacing w:after="0"/>
+        <w:spacing w:after="280" w:before="200"/>
+        <w:jc w:val="center"/>
       </w:pPr>
+      <w:r>
+        <w:rPr>
+          <w:i/>
+          <w:color w:val="647078"/>
+          <w:sz w:val="20"/>
+        </w:rPr>
+        <w:t>ESPACIO PARA CAPTURA: Azure en Play con controles visibles y conduccion activa.</w:t>
+      </w:r>
     </w:p>
     <w:p>
       <w:pPr>
@@ -2280,8 +2224,17 @@
     </w:tbl>
     <w:p>
       <w:pPr>
-        <w:spacing w:after="0"/>
+        <w:spacing w:after="280" w:before="200"/>
+        <w:jc w:val="center"/>
       </w:pPr>
+      <w:r>
+        <w:rPr>
+          <w:i/>
+          <w:color w:val="647078"/>
+          <w:sz w:val="20"/>
+        </w:rPr>
+        <w:t>ESPACIO PARA CAPTURA: Rivales en pista, cruce de meta y vueltas registradas.</w:t>
+      </w:r>
     </w:p>
     <w:p>
       <w:pPr>
@@ -2294,34 +2247,12 @@
     </w:p>
     <w:p>
       <w:r>
-        <w:t>El proyecto integra el seguimiento por waypoints en el escenario original y extiende la tecnica a una carrera de autos. La ruta de tanques permite modificar sus referencias y parametros desde el Inspector. La escena de autos hace visible el circuito y su jerarquia en modo de edicion, incluye colisiones en la pista y vehiculos, y ofrece dos metodos de seguimiento desde el panel. La interfaz permite pasar de una escena a otra y navegar por los vehiculos.</w:t>
+        <w:t>El proyecto integra el seguimiento por waypoints en el escenario original y lo extiende a una carrera conducible. El menu separa los tanques de los autos; en la carrera, el jugador conduce mientras los rivales siguen carriles, reducen velocidad en curvas y comparan waypoint con tracker desde el HUD. La pista tiene colisiones y contador de vueltas; ambas escenas muestran su jerarquia e interfaz en Unity.</w:t>
       </w:r>
     </w:p>
     <w:p>
       <w:r>
-        <w:t xml:space="preserve">La evidencia tecnica disponible confirma que los scripts compilan en las variantes runtime y Editor, y que </w:t>
-      </w:r>
-      <w:r>
-        <w:rPr>
-          <w:rFonts w:ascii="Consolas" w:hAnsi="Consolas"/>
-          <w:color w:val="245B7A"/>
-          <w:sz w:val="19"/>
-        </w:rPr>
-        <w:t>TankRacing</w:t>
-      </w:r>
-      <w:r>
-        <w:t xml:space="preserve"> contiene las referencias serializadas previstas. </w:t>
-      </w:r>
-      <w:r>
-        <w:rPr>
-          <w:rFonts w:ascii="Consolas" w:hAnsi="Consolas"/>
-          <w:color w:val="245B7A"/>
-          <w:sz w:val="19"/>
-        </w:rPr>
-        <w:t>CarCircuit</w:t>
-      </w:r>
-      <w:r>
-        <w:t xml:space="preserve"> contiene el componente constructor y su vista previa se produce al abrirla en el Editor. La comprobacion visual e interactiva en Play queda condicionada a que Unity Licensing permita abrir el Editor. Las capturas reservadas permiten completar esa parte del informe sin atribuirse resultados que no se pudieron observar.</w:t>
+        <w:t>La evidencia tecnica confirma que los scripts runtime compilan con las referencias de Unity 6 y que las escenas, rutas, colliders, controles y modos estan conectados. El intento de abrir el Editor no proporciono una superficie de interfaz controlable en esta sesion; los resultados de Play permanecen pendientes hasta registrar capturas de seleccion, movimiento y vueltas.</w:t>
       </w:r>
     </w:p>
     <w:p>

</xml_diff>